<commit_message>
Add cover page with student details to formatted assignment
Co-Authored-By: Claude Sonnet 5.5 <noreply@anthropic.com>
Claude-Session: https://claude.ai/code/session_01GuPG1GkPxQRMAjcW62QkGT
</commit_message>
<xml_diff>
--- a/Documents/Talaq_Divorce_Amendment_Act_Assignment_Formatted.docx
+++ b/Documents/Talaq_Divorce_Amendment_Act_Assignment_Formatted.docx
@@ -7,24 +7,24 @@
         <w:pStyle w:val="Title"/>
         <w:keepNext w:val="true"/>
         <w:keepLines/>
-        <w:spacing w:lineRule="auto" w:line="360" w:before="480" w:after="240"/>
+        <w:spacing w:lineRule="auto" w:line="360" w:before="2600" w:after="1400"/>
         <w:jc w:val="center"/>
         <w:rPr/>
       </w:pPr>
       <w:r>
         <w:rPr/>
-        <w:t xml:space="preserve">The Termination of a Muslim Marriage by </w:t>
-      </w:r>
-      <w:r>
-        <w:rPr>
-          <w:i/>
-          <w:iCs/>
-        </w:rPr>
-        <w:t>Talaq</w:t>
-      </w:r>
-      <w:r>
-        <w:rPr/>
-        <w:t xml:space="preserve"> after the Divorce Amendment Act 1 of 2024</w:t>
+        <w:t xml:space="preserve">THE TERMINATION OF A MUSLIM MARRIAGE BY </w:t>
+      </w:r>
+      <w:r>
+        <w:rPr>
+          <w:i/>
+          <w:iCs/>
+        </w:rPr>
+        <w:t>TALAQ</w:t>
+      </w:r>
+      <w:r>
+        <w:rPr/>
+        <w:t xml:space="preserve"> AFTER THE DIVORCE AMENDMENT ACT 1 OF 2024</w:t>
       </w:r>
     </w:p>
     <w:p>
@@ -34,7 +34,67 @@
       </w:pPr>
       <w:r>
         <w:rPr/>
-        <w:t>[Student name and student number] — [Module code]</w:t>
+        <w:t>Tshegofatso Kevin Lebepe</w:t>
+      </w:r>
+    </w:p>
+    <w:p>
+      <w:pPr>
+        <w:pStyle w:val="Author"/>
+        <w:rPr/>
+      </w:pPr>
+      <w:r>
+        <w:rPr/>
+        <w:t>Student number: 63710579</w:t>
+      </w:r>
+    </w:p>
+    <w:p>
+      <w:pPr>
+        <w:pStyle w:val="Author"/>
+        <w:rPr/>
+      </w:pPr>
+      <w:r>
+        <w:rPr/>
+        <w:t>Module: JUR5901</w:t>
+      </w:r>
+    </w:p>
+    <w:p>
+      <w:pPr>
+        <w:pStyle w:val="Author"/>
+        <w:rPr/>
+      </w:pPr>
+      <w:r>
+        <w:rPr/>
+        <w:t>Assignment 3 (2026)</w:t>
+      </w:r>
+    </w:p>
+    <w:p>
+      <w:pPr>
+        <w:pStyle w:val="Author"/>
+        <w:rPr/>
+      </w:pPr>
+      <w:r>
+        <w:rPr/>
+        <w:t> </w:t>
+      </w:r>
+    </w:p>
+    <w:p>
+      <w:pPr>
+        <w:pStyle w:val="Author"/>
+        <w:rPr/>
+      </w:pPr>
+      <w:r>
+        <w:rPr/>
+        <w:t>Module leader: Prof MM Wethmar-Lemmer</w:t>
+      </w:r>
+    </w:p>
+    <w:p>
+      <w:pPr>
+        <w:pStyle w:val="Author"/>
+        <w:rPr/>
+      </w:pPr>
+      <w:r>
+        <w:rPr/>
+        <w:t>Department of Jurisprudence, School of Law, University of South Africa</w:t>
       </w:r>
     </w:p>
     <w:sdt>
@@ -58,6 +118,9 @@
               <w:sz w:val="24"/>
             </w:rPr>
           </w:pPr>
+          <w:r>
+            <w:br w:type="page"/>
+          </w:r>
           <w:r>
             <w:rPr>
               <w:rFonts w:eastAsia="Arial" w:cs="Arial"/>
@@ -95,7 +158,7 @@
             </w:rPr>
             <w:fldChar w:fldCharType="separate"/>
           </w:r>
-          <w:hyperlink w:anchor="__RefHeading___Toc1175_325489597">
+          <w:hyperlink w:anchor="__RefHeading___Toc1207_933187192">
             <w:r>
               <w:rPr>
                 <w:webHidden/>
@@ -103,7 +166,7 @@
               </w:rPr>
               <w:t>1 Introduction</w:t>
               <w:tab/>
-              <w:t>2</w:t>
+              <w:t>3</w:t>
             </w:r>
           </w:hyperlink>
         </w:p>
@@ -116,7 +179,7 @@
             </w:tabs>
             <w:rPr/>
           </w:pPr>
-          <w:hyperlink w:anchor="__RefHeading___Toc1177_325489597">
+          <w:hyperlink w:anchor="__RefHeading___Toc1209_933187192">
             <w:r>
               <w:rPr>
                 <w:webHidden/>
@@ -138,7 +201,7 @@
               </w:rPr>
               <w:t xml:space="preserve"> after the Amendment Act</w:t>
               <w:tab/>
-              <w:t>2</w:t>
+              <w:t>3</w:t>
             </w:r>
           </w:hyperlink>
         </w:p>
@@ -151,34 +214,13 @@
             </w:tabs>
             <w:rPr/>
           </w:pPr>
-          <w:hyperlink w:anchor="__RefHeading___Toc1179_325489597">
+          <w:hyperlink w:anchor="__RefHeading___Toc1211_933187192">
             <w:r>
               <w:rPr>
                 <w:webHidden/>
                 <w:rStyle w:val="IndexLink"/>
               </w:rPr>
               <w:t>2.1 Background</w:t>
-              <w:tab/>
-              <w:t>2</w:t>
-            </w:r>
-          </w:hyperlink>
-        </w:p>
-        <w:p>
-          <w:pPr>
-            <w:pStyle w:val="TOC2"/>
-            <w:tabs>
-              <w:tab w:val="clear" w:pos="8743"/>
-              <w:tab w:val="right" w:pos="9025" w:leader="dot"/>
-            </w:tabs>
-            <w:rPr/>
-          </w:pPr>
-          <w:hyperlink w:anchor="__RefHeading___Toc1181_325489597">
-            <w:r>
-              <w:rPr>
-                <w:webHidden/>
-                <w:rStyle w:val="IndexLink"/>
-              </w:rPr>
-              <w:t>2.2 The Amendment Act</w:t>
               <w:tab/>
               <w:t>3</w:t>
             </w:r>
@@ -193,15 +235,15 @@
             </w:tabs>
             <w:rPr/>
           </w:pPr>
-          <w:hyperlink w:anchor="__RefHeading___Toc1183_325489597">
+          <w:hyperlink w:anchor="__RefHeading___Toc1213_933187192">
             <w:r>
               <w:rPr>
                 <w:webHidden/>
                 <w:rStyle w:val="IndexLink"/>
               </w:rPr>
-              <w:t>2.3 Section 6</w:t>
+              <w:t>2.2 The Amendment Act</w:t>
               <w:tab/>
-              <w:t>3</w:t>
+              <w:t>4</w:t>
             </w:r>
           </w:hyperlink>
         </w:p>
@@ -214,7 +256,28 @@
             </w:tabs>
             <w:rPr/>
           </w:pPr>
-          <w:hyperlink w:anchor="__RefHeading___Toc1185_325489597">
+          <w:hyperlink w:anchor="__RefHeading___Toc1215_933187192">
+            <w:r>
+              <w:rPr>
+                <w:webHidden/>
+                <w:rStyle w:val="IndexLink"/>
+              </w:rPr>
+              <w:t>2.3 Section 6</w:t>
+              <w:tab/>
+              <w:t>4</w:t>
+            </w:r>
+          </w:hyperlink>
+        </w:p>
+        <w:p>
+          <w:pPr>
+            <w:pStyle w:val="TOC2"/>
+            <w:tabs>
+              <w:tab w:val="clear" w:pos="8743"/>
+              <w:tab w:val="right" w:pos="9025" w:leader="dot"/>
+            </w:tabs>
+            <w:rPr/>
+          </w:pPr>
+          <w:hyperlink w:anchor="__RefHeading___Toc1217_933187192">
             <w:r>
               <w:rPr>
                 <w:webHidden/>
@@ -222,7 +285,7 @@
               </w:rPr>
               <w:t>2.4 Application</w:t>
               <w:tab/>
-              <w:t>4</w:t>
+              <w:t>5</w:t>
             </w:r>
           </w:hyperlink>
         </w:p>
@@ -235,7 +298,7 @@
             </w:tabs>
             <w:rPr/>
           </w:pPr>
-          <w:hyperlink w:anchor="__RefHeading___Toc1187_325489597">
+          <w:hyperlink w:anchor="__RefHeading___Toc1219_933187192">
             <w:r>
               <w:rPr>
                 <w:webHidden/>
@@ -256,7 +319,7 @@
                 <w:rStyle w:val="IndexLink"/>
               </w:rPr>
               <w:tab/>
-              <w:t>5</w:t>
+              <w:t>6</w:t>
             </w:r>
           </w:hyperlink>
         </w:p>
@@ -269,76 +332,13 @@
             </w:tabs>
             <w:rPr/>
           </w:pPr>
-          <w:hyperlink w:anchor="__RefHeading___Toc1189_325489597">
+          <w:hyperlink w:anchor="__RefHeading___Toc1221_933187192">
             <w:r>
               <w:rPr>
                 <w:webHidden/>
                 <w:rStyle w:val="IndexLink"/>
               </w:rPr>
               <w:t>3.1 Equality (s 9)</w:t>
-              <w:tab/>
-              <w:t>5</w:t>
-            </w:r>
-          </w:hyperlink>
-        </w:p>
-        <w:p>
-          <w:pPr>
-            <w:pStyle w:val="TOC2"/>
-            <w:tabs>
-              <w:tab w:val="clear" w:pos="8743"/>
-              <w:tab w:val="right" w:pos="9025" w:leader="dot"/>
-            </w:tabs>
-            <w:rPr/>
-          </w:pPr>
-          <w:hyperlink w:anchor="__RefHeading___Toc1191_325489597">
-            <w:r>
-              <w:rPr>
-                <w:webHidden/>
-                <w:rStyle w:val="IndexLink"/>
-              </w:rPr>
-              <w:t>3.2 Dignity (s 10)</w:t>
-              <w:tab/>
-              <w:t>5</w:t>
-            </w:r>
-          </w:hyperlink>
-        </w:p>
-        <w:p>
-          <w:pPr>
-            <w:pStyle w:val="TOC2"/>
-            <w:tabs>
-              <w:tab w:val="clear" w:pos="8743"/>
-              <w:tab w:val="right" w:pos="9025" w:leader="dot"/>
-            </w:tabs>
-            <w:rPr/>
-          </w:pPr>
-          <w:hyperlink w:anchor="__RefHeading___Toc1193_325489597">
-            <w:r>
-              <w:rPr>
-                <w:webHidden/>
-                <w:rStyle w:val="IndexLink"/>
-              </w:rPr>
-              <w:t>3.3 Religious freedom (ss 15, 31)</w:t>
-              <w:tab/>
-              <w:t>5</w:t>
-            </w:r>
-          </w:hyperlink>
-        </w:p>
-        <w:p>
-          <w:pPr>
-            <w:pStyle w:val="TOC2"/>
-            <w:tabs>
-              <w:tab w:val="clear" w:pos="8743"/>
-              <w:tab w:val="right" w:pos="9025" w:leader="dot"/>
-            </w:tabs>
-            <w:rPr/>
-          </w:pPr>
-          <w:hyperlink w:anchor="__RefHeading___Toc1195_325489597">
-            <w:r>
-              <w:rPr>
-                <w:webHidden/>
-                <w:rStyle w:val="IndexLink"/>
-              </w:rPr>
-              <w:t>3.4 Access to courts and children (ss 34, 28)</w:t>
               <w:tab/>
               <w:t>6</w:t>
             </w:r>
@@ -353,13 +353,13 @@
             </w:tabs>
             <w:rPr/>
           </w:pPr>
-          <w:hyperlink w:anchor="__RefHeading___Toc1197_325489597">
+          <w:hyperlink w:anchor="__RefHeading___Toc1223_933187192">
             <w:r>
               <w:rPr>
                 <w:webHidden/>
                 <w:rStyle w:val="IndexLink"/>
               </w:rPr>
-              <w:t>3.5 Interpretation and limitation (ss 39(2), 36)</w:t>
+              <w:t>3.2 Dignity (s 10)</w:t>
               <w:tab/>
               <w:t>6</w:t>
             </w:r>
@@ -367,20 +367,20 @@
         </w:p>
         <w:p>
           <w:pPr>
-            <w:pStyle w:val="TOC1"/>
+            <w:pStyle w:val="TOC2"/>
             <w:tabs>
-              <w:tab w:val="clear" w:pos="9026"/>
+              <w:tab w:val="clear" w:pos="8743"/>
               <w:tab w:val="right" w:pos="9025" w:leader="dot"/>
             </w:tabs>
             <w:rPr/>
           </w:pPr>
-          <w:hyperlink w:anchor="__RefHeading___Toc1199_325489597">
+          <w:hyperlink w:anchor="__RefHeading___Toc1225_933187192">
             <w:r>
               <w:rPr>
                 <w:webHidden/>
                 <w:rStyle w:val="IndexLink"/>
               </w:rPr>
-              <w:t>4 Practical and doctrinal challenges</w:t>
+              <w:t>3.3 Religious freedom (ss 15, 31)</w:t>
               <w:tab/>
               <w:t>6</w:t>
             </w:r>
@@ -388,20 +388,41 @@
         </w:p>
         <w:p>
           <w:pPr>
-            <w:pStyle w:val="TOC1"/>
+            <w:pStyle w:val="TOC2"/>
             <w:tabs>
-              <w:tab w:val="clear" w:pos="9026"/>
+              <w:tab w:val="clear" w:pos="8743"/>
               <w:tab w:val="right" w:pos="9025" w:leader="dot"/>
             </w:tabs>
             <w:rPr/>
           </w:pPr>
-          <w:hyperlink w:anchor="__RefHeading___Toc1201_325489597">
+          <w:hyperlink w:anchor="__RefHeading___Toc1227_933187192">
             <w:r>
               <w:rPr>
                 <w:webHidden/>
                 <w:rStyle w:val="IndexLink"/>
               </w:rPr>
-              <w:t>5 Counterarguments and the proper interpretation</w:t>
+              <w:t>3.4 Access to courts and children (ss 34, 28)</w:t>
+              <w:tab/>
+              <w:t>7</w:t>
+            </w:r>
+          </w:hyperlink>
+        </w:p>
+        <w:p>
+          <w:pPr>
+            <w:pStyle w:val="TOC2"/>
+            <w:tabs>
+              <w:tab w:val="clear" w:pos="8743"/>
+              <w:tab w:val="right" w:pos="9025" w:leader="dot"/>
+            </w:tabs>
+            <w:rPr/>
+          </w:pPr>
+          <w:hyperlink w:anchor="__RefHeading___Toc1229_933187192">
+            <w:r>
+              <w:rPr>
+                <w:webHidden/>
+                <w:rStyle w:val="IndexLink"/>
+              </w:rPr>
+              <w:t>3.5 Interpretation and limitation (ss 39(2), 36)</w:t>
               <w:tab/>
               <w:t>7</w:t>
             </w:r>
@@ -416,13 +437,34 @@
             </w:tabs>
             <w:rPr/>
           </w:pPr>
-          <w:hyperlink w:anchor="__RefHeading___Toc1203_325489597">
+          <w:hyperlink w:anchor="__RefHeading___Toc1231_933187192">
             <w:r>
               <w:rPr>
                 <w:webHidden/>
                 <w:rStyle w:val="IndexLink"/>
               </w:rPr>
-              <w:t>6 Remedies and order</w:t>
+              <w:t>4 Practical and doctrinal challenges</w:t>
+              <w:tab/>
+              <w:t>7</w:t>
+            </w:r>
+          </w:hyperlink>
+        </w:p>
+        <w:p>
+          <w:pPr>
+            <w:pStyle w:val="TOC1"/>
+            <w:tabs>
+              <w:tab w:val="clear" w:pos="9026"/>
+              <w:tab w:val="right" w:pos="9025" w:leader="dot"/>
+            </w:tabs>
+            <w:rPr/>
+          </w:pPr>
+          <w:hyperlink w:anchor="__RefHeading___Toc1233_933187192">
+            <w:r>
+              <w:rPr>
+                <w:webHidden/>
+                <w:rStyle w:val="IndexLink"/>
+              </w:rPr>
+              <w:t>5 Counterarguments and the proper interpretation</w:t>
               <w:tab/>
               <w:t>8</w:t>
             </w:r>
@@ -437,15 +479,15 @@
             </w:tabs>
             <w:rPr/>
           </w:pPr>
-          <w:hyperlink w:anchor="__RefHeading___Toc1205_325489597">
+          <w:hyperlink w:anchor="__RefHeading___Toc1235_933187192">
             <w:r>
               <w:rPr>
                 <w:webHidden/>
                 <w:rStyle w:val="IndexLink"/>
               </w:rPr>
-              <w:t>7 Conclusion</w:t>
+              <w:t>6 Remedies and order</w:t>
               <w:tab/>
-              <w:t>8</w:t>
+              <w:t>9</w:t>
             </w:r>
           </w:hyperlink>
         </w:p>
@@ -458,7 +500,28 @@
             </w:tabs>
             <w:rPr/>
           </w:pPr>
-          <w:hyperlink w:anchor="__RefHeading___Toc1207_325489597">
+          <w:hyperlink w:anchor="__RefHeading___Toc1237_933187192">
+            <w:r>
+              <w:rPr>
+                <w:webHidden/>
+                <w:rStyle w:val="IndexLink"/>
+              </w:rPr>
+              <w:t>7 Conclusion</w:t>
+              <w:tab/>
+              <w:t>9</w:t>
+            </w:r>
+          </w:hyperlink>
+        </w:p>
+        <w:p>
+          <w:pPr>
+            <w:pStyle w:val="TOC1"/>
+            <w:tabs>
+              <w:tab w:val="clear" w:pos="9026"/>
+              <w:tab w:val="right" w:pos="9025" w:leader="dot"/>
+            </w:tabs>
+            <w:rPr/>
+          </w:pPr>
+          <w:hyperlink w:anchor="__RefHeading___Toc1239_933187192">
             <w:r>
               <w:rPr>
                 <w:webHidden/>
@@ -466,7 +529,7 @@
               </w:rPr>
               <w:t>Bibliography</w:t>
               <w:tab/>
-              <w:t>10</w:t>
+              <w:t>11</w:t>
             </w:r>
           </w:hyperlink>
           <w:r>
@@ -496,7 +559,7 @@
         <w:spacing w:before="0" w:after="120"/>
         <w:rPr/>
       </w:pPr>
-      <w:bookmarkStart w:id="0" w:name="__RefHeading___Toc1175_325489597"/>
+      <w:bookmarkStart w:id="0" w:name="__RefHeading___Toc1207_933187192"/>
       <w:bookmarkStart w:id="1" w:name="introduction"/>
       <w:bookmarkEnd w:id="0"/>
       <w:r>
@@ -628,7 +691,7 @@
         <w:pStyle w:val="Heading1"/>
         <w:rPr/>
       </w:pPr>
-      <w:bookmarkStart w:id="2" w:name="__RefHeading___Toc1177_325489597"/>
+      <w:bookmarkStart w:id="2" w:name="__RefHeading___Toc1209_933187192"/>
       <w:bookmarkStart w:id="3" w:name="X0a17aedc4f4a1acf6363978e189dbaa4a883cb6"/>
       <w:bookmarkEnd w:id="2"/>
       <w:r>
@@ -659,7 +722,7 @@
         <w:pStyle w:val="Heading2"/>
         <w:rPr/>
       </w:pPr>
-      <w:bookmarkStart w:id="4" w:name="__RefHeading___Toc1179_325489597"/>
+      <w:bookmarkStart w:id="4" w:name="__RefHeading___Toc1211_933187192"/>
       <w:bookmarkStart w:id="5" w:name="background"/>
       <w:bookmarkEnd w:id="4"/>
       <w:r>
@@ -760,7 +823,7 @@
         <w:pStyle w:val="Heading2"/>
         <w:rPr/>
       </w:pPr>
-      <w:bookmarkStart w:id="6" w:name="__RefHeading___Toc1181_325489597"/>
+      <w:bookmarkStart w:id="6" w:name="__RefHeading___Toc1213_933187192"/>
       <w:bookmarkStart w:id="7" w:name="the-amendment-act"/>
       <w:bookmarkEnd w:id="6"/>
       <w:r>
@@ -892,7 +955,7 @@
         <w:pStyle w:val="Heading2"/>
         <w:rPr/>
       </w:pPr>
-      <w:bookmarkStart w:id="8" w:name="__RefHeading___Toc1183_325489597"/>
+      <w:bookmarkStart w:id="8" w:name="__RefHeading___Toc1215_933187192"/>
       <w:bookmarkStart w:id="9" w:name="section-6"/>
       <w:bookmarkEnd w:id="8"/>
       <w:r>
@@ -1077,7 +1140,7 @@
         <w:pStyle w:val="Heading2"/>
         <w:rPr/>
       </w:pPr>
-      <w:bookmarkStart w:id="10" w:name="__RefHeading___Toc1185_325489597"/>
+      <w:bookmarkStart w:id="10" w:name="__RefHeading___Toc1217_933187192"/>
       <w:bookmarkStart w:id="11" w:name="application"/>
       <w:bookmarkEnd w:id="10"/>
       <w:r>
@@ -1142,7 +1205,7 @@
         <w:pStyle w:val="Heading1"/>
         <w:rPr/>
       </w:pPr>
-      <w:bookmarkStart w:id="12" w:name="__RefHeading___Toc1187_325489597"/>
+      <w:bookmarkStart w:id="12" w:name="__RefHeading___Toc1219_933187192"/>
       <w:bookmarkStart w:id="13" w:name="Xee589dd567013339000a545aadebc1fd688232b"/>
       <w:bookmarkEnd w:id="12"/>
       <w:r>
@@ -1169,7 +1232,7 @@
         <w:pStyle w:val="Heading2"/>
         <w:rPr/>
       </w:pPr>
-      <w:bookmarkStart w:id="14" w:name="__RefHeading___Toc1189_325489597"/>
+      <w:bookmarkStart w:id="14" w:name="__RefHeading___Toc1221_933187192"/>
       <w:bookmarkStart w:id="15" w:name="equality-s-9"/>
       <w:bookmarkEnd w:id="14"/>
       <w:r>
@@ -1306,7 +1369,7 @@
         <w:pStyle w:val="Heading2"/>
         <w:rPr/>
       </w:pPr>
-      <w:bookmarkStart w:id="16" w:name="__RefHeading___Toc1191_325489597"/>
+      <w:bookmarkStart w:id="16" w:name="__RefHeading___Toc1223_933187192"/>
       <w:bookmarkStart w:id="17" w:name="dignity-s-10"/>
       <w:bookmarkEnd w:id="16"/>
       <w:r>
@@ -1348,7 +1411,7 @@
         <w:pStyle w:val="Heading2"/>
         <w:rPr/>
       </w:pPr>
-      <w:bookmarkStart w:id="18" w:name="__RefHeading___Toc1193_325489597"/>
+      <w:bookmarkStart w:id="18" w:name="__RefHeading___Toc1225_933187192"/>
       <w:bookmarkStart w:id="19" w:name="religious-freedom-ss-15-31"/>
       <w:bookmarkEnd w:id="18"/>
       <w:r>
@@ -1432,7 +1495,7 @@
         <w:pStyle w:val="Heading2"/>
         <w:rPr/>
       </w:pPr>
-      <w:bookmarkStart w:id="20" w:name="__RefHeading___Toc1195_325489597"/>
+      <w:bookmarkStart w:id="20" w:name="__RefHeading___Toc1227_933187192"/>
       <w:bookmarkStart w:id="21" w:name="access-to-courts-and-children-ss-34-28"/>
       <w:bookmarkEnd w:id="20"/>
       <w:r>
@@ -1485,7 +1548,7 @@
         <w:pStyle w:val="Heading2"/>
         <w:rPr/>
       </w:pPr>
-      <w:bookmarkStart w:id="22" w:name="__RefHeading___Toc1197_325489597"/>
+      <w:bookmarkStart w:id="22" w:name="__RefHeading___Toc1229_933187192"/>
       <w:bookmarkStart w:id="23" w:name="interpretation-and-limitation-ss-392-36"/>
       <w:bookmarkEnd w:id="22"/>
       <w:r>
@@ -1550,7 +1613,7 @@
         <w:pStyle w:val="Heading1"/>
         <w:rPr/>
       </w:pPr>
-      <w:bookmarkStart w:id="24" w:name="__RefHeading___Toc1199_325489597"/>
+      <w:bookmarkStart w:id="24" w:name="__RefHeading___Toc1231_933187192"/>
       <w:bookmarkStart w:id="25" w:name="practical-and-doctrinal-challenges"/>
       <w:bookmarkEnd w:id="24"/>
       <w:r>
@@ -1773,7 +1836,7 @@
         <w:pStyle w:val="Heading1"/>
         <w:rPr/>
       </w:pPr>
-      <w:bookmarkStart w:id="26" w:name="__RefHeading___Toc1201_325489597"/>
+      <w:bookmarkStart w:id="26" w:name="__RefHeading___Toc1233_933187192"/>
       <w:bookmarkStart w:id="27" w:name="X2c78ccdf42f68fc5ff09330797eb15297bf239b"/>
       <w:bookmarkEnd w:id="26"/>
       <w:r>
@@ -1891,7 +1954,7 @@
         <w:pStyle w:val="Heading1"/>
         <w:rPr/>
       </w:pPr>
-      <w:bookmarkStart w:id="29" w:name="__RefHeading___Toc1203_325489597"/>
+      <w:bookmarkStart w:id="29" w:name="__RefHeading___Toc1235_933187192"/>
       <w:bookmarkStart w:id="30" w:name="remedies-and-order"/>
       <w:bookmarkEnd w:id="29"/>
       <w:r>
@@ -1986,7 +2049,7 @@
         <w:pStyle w:val="Heading1"/>
         <w:rPr/>
       </w:pPr>
-      <w:bookmarkStart w:id="31" w:name="__RefHeading___Toc1205_325489597"/>
+      <w:bookmarkStart w:id="31" w:name="__RefHeading___Toc1237_933187192"/>
       <w:bookmarkStart w:id="32" w:name="conclusion"/>
       <w:bookmarkEnd w:id="31"/>
       <w:bookmarkEnd w:id="32"/>
@@ -2149,7 +2212,7 @@
         <w:spacing w:before="0" w:after="120"/>
         <w:rPr/>
       </w:pPr>
-      <w:bookmarkStart w:id="35" w:name="__RefHeading___Toc1207_325489597"/>
+      <w:bookmarkStart w:id="35" w:name="__RefHeading___Toc1239_933187192"/>
       <w:bookmarkStart w:id="36" w:name="bibliography"/>
       <w:bookmarkEnd w:id="35"/>
       <w:r>
@@ -2626,6 +2689,7 @@
       <w:pgMar w:left="1440" w:right="1440" w:gutter="0" w:header="0" w:top="1440" w:footer="720" w:bottom="1440"/>
       <w:pgNumType w:fmt="decimal"/>
       <w:formProt w:val="false"/>
+      <w:titlePg/>
       <w:textDirection w:val="lrTb"/>
       <w:docGrid w:type="default" w:linePitch="100" w:charSpace="0"/>
     </w:sectPr>
@@ -2671,7 +2735,7 @@
     </w:r>
     <w:r>
       <w:rPr/>
-      <w:t>11</w:t>
+      <w:t>12</w:t>
     </w:r>
     <w:r>
       <w:rPr/>
@@ -2687,28 +2751,10 @@
     <w:pPr>
       <w:pStyle w:val="Footer"/>
       <w:spacing w:before="0" w:after="120"/>
-      <w:jc w:val="center"/>
       <w:rPr/>
     </w:pPr>
     <w:r>
       <w:rPr/>
-      <w:fldChar w:fldCharType="begin"/>
-    </w:r>
-    <w:r>
-      <w:rPr/>
-      <w:instrText xml:space="preserve"> PAGE </w:instrText>
-    </w:r>
-    <w:r>
-      <w:rPr/>
-      <w:fldChar w:fldCharType="separate"/>
-    </w:r>
-    <w:r>
-      <w:rPr/>
-      <w:t>11</w:t>
-    </w:r>
-    <w:r>
-      <w:rPr/>
-      <w:fldChar w:fldCharType="end"/>
     </w:r>
   </w:p>
 </w:ftr>
@@ -4279,7 +4325,7 @@
     <w:pPr>
       <w:keepNext w:val="true"/>
       <w:keepLines/>
-      <w:spacing w:lineRule="auto" w:line="360" w:before="480" w:after="240"/>
+      <w:spacing w:lineRule="auto" w:line="360" w:before="2600" w:after="1400"/>
       <w:jc w:val="center"/>
     </w:pPr>
     <w:rPr>
@@ -4319,7 +4365,7 @@
       <w:keepLines/>
       <w:widowControl/>
       <w:bidi w:val="0"/>
-      <w:spacing w:lineRule="auto" w:line="360" w:before="0" w:after="200"/>
+      <w:spacing w:lineRule="auto" w:line="360" w:before="0" w:after="120"/>
       <w:jc w:val="center"/>
     </w:pPr>
     <w:rPr>
@@ -4341,7 +4387,7 @@
       <w:keepLines/>
       <w:widowControl/>
       <w:bidi w:val="0"/>
-      <w:spacing w:lineRule="auto" w:line="360" w:before="0" w:after="200"/>
+      <w:spacing w:lineRule="auto" w:line="360" w:before="0" w:after="120"/>
       <w:jc w:val="center"/>
     </w:pPr>
     <w:rPr>
@@ -4494,6 +4540,7 @@
     <w:unhideWhenUsed/>
     <w:qFormat/>
     <w:pPr>
+      <w:pageBreakBefore/>
       <w:spacing w:lineRule="auto" w:line="360" w:before="240" w:after="120"/>
       <w:jc w:val="left"/>
       <w:outlineLvl w:val="9"/>

</xml_diff>

<commit_message>
Condense formatted assignment to five pages of substantive content
Co-Authored-By: Claude Sonnet 5.5 <noreply@anthropic.com>
Claude-Session: https://claude.ai/code/session_01GuPG1GkPxQRMAjcW62QkGT
</commit_message>
<xml_diff>
--- a/Documents/Talaq_Divorce_Amendment_Act_Assignment_Formatted.docx
+++ b/Documents/Talaq_Divorce_Amendment_Act_Assignment_Formatted.docx
@@ -158,7 +158,7 @@
             </w:rPr>
             <w:fldChar w:fldCharType="separate"/>
           </w:r>
-          <w:hyperlink w:anchor="__RefHeading___Toc1207_933187192">
+          <w:hyperlink w:anchor="__RefHeading___Toc945_3227372185">
             <w:r>
               <w:rPr>
                 <w:webHidden/>
@@ -179,7 +179,7 @@
             </w:tabs>
             <w:rPr/>
           </w:pPr>
-          <w:hyperlink w:anchor="__RefHeading___Toc1209_933187192">
+          <w:hyperlink w:anchor="__RefHeading___Toc947_3227372185">
             <w:r>
               <w:rPr>
                 <w:webHidden/>
@@ -214,13 +214,13 @@
             </w:tabs>
             <w:rPr/>
           </w:pPr>
-          <w:hyperlink w:anchor="__RefHeading___Toc1211_933187192">
+          <w:hyperlink w:anchor="__RefHeading___Toc949_3227372185">
             <w:r>
               <w:rPr>
                 <w:webHidden/>
                 <w:rStyle w:val="IndexLink"/>
               </w:rPr>
-              <w:t>2.1 Background</w:t>
+              <w:t>2.1 The Amendment Act</w:t>
               <w:tab/>
               <w:t>3</w:t>
             </w:r>
@@ -235,13 +235,13 @@
             </w:tabs>
             <w:rPr/>
           </w:pPr>
-          <w:hyperlink w:anchor="__RefHeading___Toc1213_933187192">
+          <w:hyperlink w:anchor="__RefHeading___Toc951_3227372185">
             <w:r>
               <w:rPr>
                 <w:webHidden/>
                 <w:rStyle w:val="IndexLink"/>
               </w:rPr>
-              <w:t>2.2 The Amendment Act</w:t>
+              <w:t>2.2 Section 6</w:t>
               <w:tab/>
               <w:t>4</w:t>
             </w:r>
@@ -256,34 +256,13 @@
             </w:tabs>
             <w:rPr/>
           </w:pPr>
-          <w:hyperlink w:anchor="__RefHeading___Toc1215_933187192">
+          <w:hyperlink w:anchor="__RefHeading___Toc953_3227372185">
             <w:r>
               <w:rPr>
                 <w:webHidden/>
                 <w:rStyle w:val="IndexLink"/>
               </w:rPr>
-              <w:t>2.3 Section 6</w:t>
-              <w:tab/>
-              <w:t>4</w:t>
-            </w:r>
-          </w:hyperlink>
-        </w:p>
-        <w:p>
-          <w:pPr>
-            <w:pStyle w:val="TOC2"/>
-            <w:tabs>
-              <w:tab w:val="clear" w:pos="8743"/>
-              <w:tab w:val="right" w:pos="9025" w:leader="dot"/>
-            </w:tabs>
-            <w:rPr/>
-          </w:pPr>
-          <w:hyperlink w:anchor="__RefHeading___Toc1217_933187192">
-            <w:r>
-              <w:rPr>
-                <w:webHidden/>
-                <w:rStyle w:val="IndexLink"/>
-              </w:rPr>
-              <w:t>2.4 Application</w:t>
+              <w:t>2.3 Application</w:t>
               <w:tab/>
               <w:t>5</w:t>
             </w:r>
@@ -298,7 +277,7 @@
             </w:tabs>
             <w:rPr/>
           </w:pPr>
-          <w:hyperlink w:anchor="__RefHeading___Toc1219_933187192">
+          <w:hyperlink w:anchor="__RefHeading___Toc955_3227372185">
             <w:r>
               <w:rPr>
                 <w:webHidden/>
@@ -319,7 +298,7 @@
                 <w:rStyle w:val="IndexLink"/>
               </w:rPr>
               <w:tab/>
-              <w:t>6</w:t>
+              <w:t>5</w:t>
             </w:r>
           </w:hyperlink>
         </w:p>
@@ -332,15 +311,15 @@
             </w:tabs>
             <w:rPr/>
           </w:pPr>
-          <w:hyperlink w:anchor="__RefHeading___Toc1221_933187192">
+          <w:hyperlink w:anchor="__RefHeading___Toc957_3227372185">
             <w:r>
               <w:rPr>
                 <w:webHidden/>
                 <w:rStyle w:val="IndexLink"/>
               </w:rPr>
-              <w:t>3.1 Equality (s 9)</w:t>
+              <w:t>3.1 Equality and dignity</w:t>
               <w:tab/>
-              <w:t>6</w:t>
+              <w:t>5</w:t>
             </w:r>
           </w:hyperlink>
         </w:p>
@@ -353,15 +332,15 @@
             </w:tabs>
             <w:rPr/>
           </w:pPr>
-          <w:hyperlink w:anchor="__RefHeading___Toc1223_933187192">
+          <w:hyperlink w:anchor="__RefHeading___Toc959_3227372185">
             <w:r>
               <w:rPr>
                 <w:webHidden/>
                 <w:rStyle w:val="IndexLink"/>
               </w:rPr>
-              <w:t>3.2 Dignity (s 10)</w:t>
+              <w:t>3.2 Religious freedom</w:t>
               <w:tab/>
-              <w:t>6</w:t>
+              <w:t>5</w:t>
             </w:r>
           </w:hyperlink>
         </w:p>
@@ -374,13 +353,13 @@
             </w:tabs>
             <w:rPr/>
           </w:pPr>
-          <w:hyperlink w:anchor="__RefHeading___Toc1225_933187192">
+          <w:hyperlink w:anchor="__RefHeading___Toc961_3227372185">
             <w:r>
               <w:rPr>
                 <w:webHidden/>
                 <w:rStyle w:val="IndexLink"/>
               </w:rPr>
-              <w:t>3.3 Religious freedom (ss 15, 31)</w:t>
+              <w:t>3.3 Access to courts, children and limitation</w:t>
               <w:tab/>
               <w:t>6</w:t>
             </w:r>
@@ -388,41 +367,41 @@
         </w:p>
         <w:p>
           <w:pPr>
-            <w:pStyle w:val="TOC2"/>
+            <w:pStyle w:val="TOC1"/>
             <w:tabs>
-              <w:tab w:val="clear" w:pos="8743"/>
+              <w:tab w:val="clear" w:pos="9026"/>
               <w:tab w:val="right" w:pos="9025" w:leader="dot"/>
             </w:tabs>
             <w:rPr/>
           </w:pPr>
-          <w:hyperlink w:anchor="__RefHeading___Toc1227_933187192">
+          <w:hyperlink w:anchor="__RefHeading___Toc963_3227372185">
             <w:r>
               <w:rPr>
                 <w:webHidden/>
                 <w:rStyle w:val="IndexLink"/>
               </w:rPr>
-              <w:t>3.4 Access to courts and children (ss 34, 28)</w:t>
+              <w:t>4 Practical and doctrinal challenges</w:t>
               <w:tab/>
-              <w:t>7</w:t>
+              <w:t>6</w:t>
             </w:r>
           </w:hyperlink>
         </w:p>
         <w:p>
           <w:pPr>
-            <w:pStyle w:val="TOC2"/>
+            <w:pStyle w:val="TOC1"/>
             <w:tabs>
-              <w:tab w:val="clear" w:pos="8743"/>
+              <w:tab w:val="clear" w:pos="9026"/>
               <w:tab w:val="right" w:pos="9025" w:leader="dot"/>
             </w:tabs>
             <w:rPr/>
           </w:pPr>
-          <w:hyperlink w:anchor="__RefHeading___Toc1229_933187192">
+          <w:hyperlink w:anchor="__RefHeading___Toc965_3227372185">
             <w:r>
               <w:rPr>
                 <w:webHidden/>
                 <w:rStyle w:val="IndexLink"/>
               </w:rPr>
-              <w:t>3.5 Interpretation and limitation (ss 39(2), 36)</w:t>
+              <w:t>5 Interpretation, counterarguments and order</w:t>
               <w:tab/>
               <w:t>7</w:t>
             </w:r>
@@ -437,13 +416,13 @@
             </w:tabs>
             <w:rPr/>
           </w:pPr>
-          <w:hyperlink w:anchor="__RefHeading___Toc1231_933187192">
+          <w:hyperlink w:anchor="__RefHeading___Toc967_3227372185">
             <w:r>
               <w:rPr>
                 <w:webHidden/>
                 <w:rStyle w:val="IndexLink"/>
               </w:rPr>
-              <w:t>4 Practical and doctrinal challenges</w:t>
+              <w:t>6 Conclusion</w:t>
               <w:tab/>
               <w:t>7</w:t>
             </w:r>
@@ -458,70 +437,7 @@
             </w:tabs>
             <w:rPr/>
           </w:pPr>
-          <w:hyperlink w:anchor="__RefHeading___Toc1233_933187192">
-            <w:r>
-              <w:rPr>
-                <w:webHidden/>
-                <w:rStyle w:val="IndexLink"/>
-              </w:rPr>
-              <w:t>5 Counterarguments and the proper interpretation</w:t>
-              <w:tab/>
-              <w:t>8</w:t>
-            </w:r>
-          </w:hyperlink>
-        </w:p>
-        <w:p>
-          <w:pPr>
-            <w:pStyle w:val="TOC1"/>
-            <w:tabs>
-              <w:tab w:val="clear" w:pos="9026"/>
-              <w:tab w:val="right" w:pos="9025" w:leader="dot"/>
-            </w:tabs>
-            <w:rPr/>
-          </w:pPr>
-          <w:hyperlink w:anchor="__RefHeading___Toc1235_933187192">
-            <w:r>
-              <w:rPr>
-                <w:webHidden/>
-                <w:rStyle w:val="IndexLink"/>
-              </w:rPr>
-              <w:t>6 Remedies and order</w:t>
-              <w:tab/>
-              <w:t>9</w:t>
-            </w:r>
-          </w:hyperlink>
-        </w:p>
-        <w:p>
-          <w:pPr>
-            <w:pStyle w:val="TOC1"/>
-            <w:tabs>
-              <w:tab w:val="clear" w:pos="9026"/>
-              <w:tab w:val="right" w:pos="9025" w:leader="dot"/>
-            </w:tabs>
-            <w:rPr/>
-          </w:pPr>
-          <w:hyperlink w:anchor="__RefHeading___Toc1237_933187192">
-            <w:r>
-              <w:rPr>
-                <w:webHidden/>
-                <w:rStyle w:val="IndexLink"/>
-              </w:rPr>
-              <w:t>7 Conclusion</w:t>
-              <w:tab/>
-              <w:t>9</w:t>
-            </w:r>
-          </w:hyperlink>
-        </w:p>
-        <w:p>
-          <w:pPr>
-            <w:pStyle w:val="TOC1"/>
-            <w:tabs>
-              <w:tab w:val="clear" w:pos="9026"/>
-              <w:tab w:val="right" w:pos="9025" w:leader="dot"/>
-            </w:tabs>
-            <w:rPr/>
-          </w:pPr>
-          <w:hyperlink w:anchor="__RefHeading___Toc1239_933187192">
+          <w:hyperlink w:anchor="__RefHeading___Toc969_3227372185">
             <w:r>
               <w:rPr>
                 <w:webHidden/>
@@ -529,7 +445,7 @@
               </w:rPr>
               <w:t>Bibliography</w:t>
               <w:tab/>
-              <w:t>11</w:t>
+              <w:t>8</w:t>
             </w:r>
           </w:hyperlink>
           <w:r>
@@ -559,7 +475,7 @@
         <w:spacing w:before="0" w:after="120"/>
         <w:rPr/>
       </w:pPr>
-      <w:bookmarkStart w:id="0" w:name="__RefHeading___Toc1207_933187192"/>
+      <w:bookmarkStart w:id="0" w:name="__RefHeading___Toc945_3227372185"/>
       <w:bookmarkStart w:id="1" w:name="introduction"/>
       <w:bookmarkEnd w:id="0"/>
       <w:r>
@@ -581,7 +497,7 @@
       </w:pPr>
       <w:r>
         <w:rPr/>
-        <w:t>Muslim marriages were historically not recognised within South Africa’s statutory marriage and divorce framework. Islamic law recognises several forms of dissolution, whereas South African law provides a court-based divorce system, and Osman-Hyder notes that this gap created uncertainty and exposed spouses, particularly women, to prejudice and abuse.</w:t>
+        <w:t>Muslim marriages were historically outside South Africa’s statutory marriage and divorce framework, which left spouses, particularly women, exposed on dissolution.</w:t>
       </w:r>
       <w:r>
         <w:rPr>
@@ -613,7 +529,7 @@
       </w:r>
       <w:r>
         <w:rPr/>
-        <w:t>”) the Constitutional Court confirmed the constitutional deficiencies caused by the exclusion of Muslim marriages from the Divorce Act 70 of 1979.</w:t>
+        <w:t>”) the Constitutional Court confirmed the resulting constitutional deficiencies,</w:t>
       </w:r>
       <w:r>
         <w:rPr>
@@ -623,7 +539,7 @@
       </w:r>
       <w:r>
         <w:rPr/>
-        <w:t xml:space="preserve"> Parliament responded with the Divorce Amendment Act 1 of 2024 (“the Amendment Act”), which commenced on 14 May 2024.</w:t>
+        <w:t xml:space="preserve"> and Parliament responded with the Divorce Amendment Act 1 of 2024 (“the Amendment Act”), which commenced on 14 May 2024.</w:t>
       </w:r>
       <w:r>
         <w:rPr>
@@ -650,7 +566,7 @@
       </w:r>
       <w:r>
         <w:rPr/>
-        <w:t xml:space="preserve"> before two witnesses. Amina disputes its effect, and Farouk seeks a declarator that it lawfully dissolved the marriage.</w:t>
+        <w:t xml:space="preserve"> before two witnesses. Amina disputes its effect, and Farouk seeks a declarator that it dissolved the marriage.</w:t>
       </w:r>
     </w:p>
     <w:p>
@@ -660,7 +576,7 @@
       </w:pPr>
       <w:r>
         <w:rPr/>
-        <w:t xml:space="preserve">My thesis is that the Amendment Act does not declare </w:t>
+        <w:t xml:space="preserve">The Amendment Act does not declare </w:t>
       </w:r>
       <w:r>
         <w:rPr>
@@ -671,18 +587,7 @@
       </w:r>
       <w:r>
         <w:rPr/>
-        <w:t xml:space="preserve"> religiously invalid, and a court need not decide its religious validity. For civil-law purposes, however, the marriage subsists until a court grants a decree. Amina is entitled to pursue a civil divorce notwithstanding the </w:t>
-      </w:r>
-      <w:r>
-        <w:rPr>
-          <w:i/>
-          <w:iCs/>
-        </w:rPr>
-        <w:t>talaq</w:t>
-      </w:r>
-      <w:r>
-        <w:rPr/>
-        <w:t>, and Farouk’s declarator should be refused in the broad form in which he seeks it. Section 6 of the Amendment Act creates a real interpretative difficulty, but it is best resolved in Amina’s favour.</w:t>
+        <w:t xml:space="preserve"> religiously invalid, and a court need not decide its religious validity. For civil-law purposes, however, the marriage subsists until a court grants a decree. Farouk’s declarator should therefore be refused in its broad form and Amina may pursue a civil divorce. Section 6 of the Amendment Act creates a real difficulty, but it is best resolved in her favour.</w:t>
       </w:r>
       <w:bookmarkEnd w:id="1"/>
     </w:p>
@@ -691,7 +596,7 @@
         <w:pStyle w:val="Heading1"/>
         <w:rPr/>
       </w:pPr>
-      <w:bookmarkStart w:id="2" w:name="__RefHeading___Toc1209_933187192"/>
+      <w:bookmarkStart w:id="2" w:name="__RefHeading___Toc947_3227372185"/>
       <w:bookmarkStart w:id="3" w:name="X0a17aedc4f4a1acf6363978e189dbaa4a883cb6"/>
       <w:bookmarkEnd w:id="2"/>
       <w:r>
@@ -722,115 +627,14 @@
         <w:pStyle w:val="Heading2"/>
         <w:rPr/>
       </w:pPr>
-      <w:bookmarkStart w:id="4" w:name="__RefHeading___Toc1211_933187192"/>
-      <w:bookmarkStart w:id="5" w:name="background"/>
+      <w:bookmarkStart w:id="4" w:name="__RefHeading___Toc949_3227372185"/>
+      <w:bookmarkStart w:id="5" w:name="the-amendment-act"/>
       <w:bookmarkEnd w:id="4"/>
       <w:r>
         <w:rPr>
           <w:rStyle w:val="SectionNumber"/>
         </w:rPr>
         <w:t>2.1</w:t>
-      </w:r>
-      <w:r>
-        <w:rPr/>
-        <w:tab/>
-        <w:t>Background</w:t>
-      </w:r>
-    </w:p>
-    <w:p>
-      <w:pPr>
-        <w:pStyle w:val="FirstParagraph"/>
-        <w:rPr/>
-      </w:pPr>
-      <w:r>
-        <w:rPr/>
-        <w:t xml:space="preserve">Courts recognised Muslim marriages only piecemeal. </w:t>
-      </w:r>
-      <w:r>
-        <w:rPr>
-          <w:i/>
-          <w:iCs/>
-        </w:rPr>
-        <w:t>Ryland v Edros</w:t>
-      </w:r>
-      <w:r>
-        <w:rPr/>
-        <w:t xml:space="preserve"> enforced contractual consequences of a Muslim marriage and rejected a blanket public-policy objection.</w:t>
-      </w:r>
-      <w:r>
-        <w:rPr>
-          <w:rStyle w:val="FootnoteReference"/>
-        </w:rPr>
-        <w:footnoteReference w:id="5"/>
-      </w:r>
-      <w:r>
-        <w:rPr/>
-        <w:t xml:space="preserve"> In </w:t>
-      </w:r>
-      <w:r>
-        <w:rPr>
-          <w:i/>
-          <w:iCs/>
-        </w:rPr>
-        <w:t>Daniels v Campbell NO</w:t>
-      </w:r>
-      <w:r>
-        <w:rPr/>
-        <w:t xml:space="preserve"> the Constitutional Court held that “spouse” in the Intestate Succession Act 81 of 1987 and “survivor” in the Maintenance of Surviving Spouses Act 27 of 1990 include the surviving partner of a monogamous Muslim marriage, and in </w:t>
-      </w:r>
-      <w:r>
-        <w:rPr>
-          <w:i/>
-          <w:iCs/>
-        </w:rPr>
-        <w:t>Hassam v Jacobs NO</w:t>
-      </w:r>
-      <w:r>
-        <w:rPr/>
-        <w:t xml:space="preserve"> it extended that protection to a polygynous marriage.</w:t>
-      </w:r>
-      <w:r>
-        <w:rPr>
-          <w:rStyle w:val="FootnoteReference"/>
-        </w:rPr>
-        <w:footnoteReference w:id="6"/>
-      </w:r>
-      <w:r>
-        <w:rPr/>
-        <w:t xml:space="preserve"> These cases protected surviving spouses but did not regulate divorce. </w:t>
-      </w:r>
-      <w:r>
-        <w:rPr>
-          <w:i/>
-          <w:iCs/>
-        </w:rPr>
-        <w:t>WLCT</w:t>
-      </w:r>
-      <w:r>
-        <w:rPr/>
-        <w:t xml:space="preserve"> held that the failure to recognise and regulate Muslim marriages infringed equality, dignity, children’s rights and access to courts, and required legislative action.</w:t>
-      </w:r>
-      <w:r>
-        <w:rPr>
-          <w:rStyle w:val="FootnoteReference"/>
-        </w:rPr>
-        <w:footnoteReference w:id="7"/>
-      </w:r>
-      <w:bookmarkEnd w:id="5"/>
-    </w:p>
-    <w:p>
-      <w:pPr>
-        <w:pStyle w:val="Heading2"/>
-        <w:rPr/>
-      </w:pPr>
-      <w:bookmarkStart w:id="6" w:name="__RefHeading___Toc1213_933187192"/>
-      <w:bookmarkStart w:id="7" w:name="the-amendment-act"/>
-      <w:bookmarkEnd w:id="6"/>
-      <w:r>
-        <w:rPr>
-          <w:rStyle w:val="SectionNumber"/>
-        </w:rPr>
-        <w:t>2.2</w:t>
       </w:r>
       <w:r>
         <w:rPr/>
@@ -845,43 +649,86 @@
       </w:pPr>
       <w:r>
         <w:rPr/>
-        <w:t>The Amendment Act defines a “Muslim marriage” as a marriage entered into or concluded in accordance with the tenets of Islam, so the parties’ marriage qualifies.</w:t>
+        <w:t>Courts recognised Muslim marriages only piecemeal, for contractual and succession purposes, without regulating divorce.</w:t>
       </w:r>
       <w:r>
         <w:rPr>
           <w:rStyle w:val="FootnoteReference"/>
         </w:rPr>
+        <w:footnoteReference w:id="5"/>
+      </w:r>
+      <w:r>
+        <w:rPr/>
+        <w:t xml:space="preserve"> The Amendment Act now defines a “Muslim marriage” as one concluded in accordance with the tenets of Islam, so the parties’ marriage qualifies, and amended section 3 of the Divorce Act provides that “[a] marriage, including a Muslim marriage, may be dissolved by a court by a decree of divorce”.</w:t>
+      </w:r>
+      <w:r>
+        <w:rPr>
+          <w:rStyle w:val="FootnoteReference"/>
+        </w:rPr>
+        <w:footnoteReference w:id="6"/>
+      </w:r>
+      <w:r>
+        <w:rPr/>
+        <w:t xml:space="preserve"> This accords with the common-law rule that a marriage ends only by death or court decree, so that civil status changes at one provable moment.</w:t>
+      </w:r>
+      <w:r>
+        <w:rPr>
+          <w:rStyle w:val="FootnoteReference"/>
+        </w:rPr>
+        <w:footnoteReference w:id="7"/>
+      </w:r>
+    </w:p>
+    <w:p>
+      <w:pPr>
+        <w:pStyle w:val="BodyText"/>
+        <w:rPr/>
+      </w:pPr>
+      <w:r>
+        <w:rPr/>
+        <w:t xml:space="preserve">The Act does not, however, abolish </w:t>
+      </w:r>
+      <w:r>
+        <w:rPr>
+          <w:i/>
+          <w:iCs/>
+        </w:rPr>
+        <w:t>talaq</w:t>
+      </w:r>
+      <w:r>
+        <w:rPr/>
+        <w:t xml:space="preserve">. Mujuzi observes that it is silent on whether a husband retains that power, and equally silent on a wife’s </w:t>
+      </w:r>
+      <w:r>
+        <w:rPr>
+          <w:i/>
+          <w:iCs/>
+        </w:rPr>
+        <w:t>khul‘</w:t>
+      </w:r>
+      <w:r>
+        <w:rPr/>
+        <w:t xml:space="preserve"> or </w:t>
+      </w:r>
+      <w:r>
+        <w:rPr>
+          <w:i/>
+          <w:iCs/>
+        </w:rPr>
+        <w:t>faskh</w:t>
+      </w:r>
+      <w:r>
+        <w:rPr/>
+        <w:t>.</w:t>
+      </w:r>
+      <w:r>
+        <w:rPr>
+          <w:rStyle w:val="FootnoteReference"/>
+        </w:rPr>
         <w:footnoteReference w:id="8"/>
       </w:r>
       <w:r>
         <w:rPr/>
-        <w:t xml:space="preserve"> Amended section 3 of the Divorce Act provides that “[a] marriage, including a Muslim marriage, may be dissolved by a court by a decree of divorce”.</w:t>
-      </w:r>
-      <w:r>
-        <w:rPr>
-          <w:rStyle w:val="FootnoteReference"/>
-        </w:rPr>
-        <w:footnoteReference w:id="9"/>
-      </w:r>
-      <w:r>
-        <w:rPr/>
-        <w:t xml:space="preserve"> This accords with the common-law rule that a marriage ends only by death or court decree, so that civil status changes at one identifiable and provable moment.</w:t>
-      </w:r>
-      <w:r>
-        <w:rPr>
-          <w:rStyle w:val="FootnoteReference"/>
-        </w:rPr>
-        <w:footnoteReference w:id="10"/>
-      </w:r>
-    </w:p>
-    <w:p>
-      <w:pPr>
-        <w:pStyle w:val="BodyText"/>
-        <w:rPr/>
-      </w:pPr>
-      <w:r>
-        <w:rPr/>
-        <w:t xml:space="preserve">The Act does not, however, abolish </w:t>
+        <w:t xml:space="preserve"> The question is therefore not whether Farouk’s </w:t>
       </w:r>
       <w:r>
         <w:rPr>
@@ -892,77 +739,23 @@
       </w:r>
       <w:r>
         <w:rPr/>
-        <w:t xml:space="preserve">. Mujuzi points out that it is silent on whether a husband retains the power to terminate by </w:t>
-      </w:r>
-      <w:r>
-        <w:rPr>
-          <w:i/>
-          <w:iCs/>
-        </w:rPr>
-        <w:t>talaq</w:t>
-      </w:r>
-      <w:r>
-        <w:rPr/>
-        <w:t xml:space="preserve">, and equally silent on a wife’s </w:t>
-      </w:r>
-      <w:r>
-        <w:rPr>
-          <w:i/>
-          <w:iCs/>
-        </w:rPr>
-        <w:t>khul‘</w:t>
-      </w:r>
-      <w:r>
-        <w:rPr/>
-        <w:t xml:space="preserve"> or </w:t>
-      </w:r>
-      <w:r>
-        <w:rPr>
-          <w:i/>
-          <w:iCs/>
-        </w:rPr>
-        <w:t>faskh</w:t>
-      </w:r>
-      <w:r>
-        <w:rPr/>
-        <w:t>.</w:t>
-      </w:r>
-      <w:r>
-        <w:rPr>
-          <w:rStyle w:val="FootnoteReference"/>
-        </w:rPr>
-        <w:footnoteReference w:id="11"/>
-      </w:r>
-      <w:r>
-        <w:rPr/>
-        <w:t xml:space="preserve"> The question is therefore not whether Farouk’s </w:t>
-      </w:r>
-      <w:r>
-        <w:rPr>
-          <w:i/>
-          <w:iCs/>
-        </w:rPr>
-        <w:t>talaq</w:t>
-      </w:r>
-      <w:r>
-        <w:rPr/>
-        <w:t xml:space="preserve"> is valid in Islamic law (on which the schools differ, and which a court is ill-placed to decide), but whether it removes the marriage from the Divorce Act or ousts the court’s divorce jurisdiction.</w:t>
-      </w:r>
-      <w:bookmarkEnd w:id="7"/>
+        <w:t xml:space="preserve"> is valid in Islamic law, but whether it removes the marriage from the Divorce Act or ousts the court’s jurisdiction.</w:t>
+      </w:r>
+      <w:bookmarkEnd w:id="5"/>
     </w:p>
     <w:p>
       <w:pPr>
         <w:pStyle w:val="Heading2"/>
         <w:rPr/>
       </w:pPr>
-      <w:bookmarkStart w:id="8" w:name="__RefHeading___Toc1215_933187192"/>
-      <w:bookmarkStart w:id="9" w:name="section-6"/>
-      <w:bookmarkEnd w:id="8"/>
+      <w:bookmarkStart w:id="6" w:name="__RefHeading___Toc951_3227372185"/>
+      <w:bookmarkStart w:id="7" w:name="section-6"/>
+      <w:bookmarkEnd w:id="6"/>
       <w:r>
         <w:rPr>
           <w:rStyle w:val="SectionNumber"/>
         </w:rPr>
-        <w:t>2.3</w:t>
+        <w:t>2.2</w:t>
       </w:r>
       <w:r>
         <w:rPr/>
@@ -977,13 +770,28 @@
       </w:pPr>
       <w:r>
         <w:rPr/>
-        <w:t>Section 6 provides that the Act “applies to all subsisting Muslim marriages, including a Muslim marriage (a) which was terminated or dissolved in accordance with the tenets of Islam and where legal proceedings for the dissolution of the said Muslim marriage in terms of the Divorce Act … have been instituted but not yet finalised; and (b) which subsisted as at 15 December 2014.”</w:t>
+        <w:t>Section 6 applies the Act to “all subsisting Muslim marriages, including a Muslim marriage (a) which was terminated or dissolved in accordance with the tenets of Islam and where legal proceedings for [its] dissolution in terms of the Divorce Act … have been instituted but not yet finalised; and (b) which subsisted as at 15 December 2014”.</w:t>
       </w:r>
       <w:r>
         <w:rPr>
           <w:rStyle w:val="FootnoteReference"/>
         </w:rPr>
-        <w:footnoteReference w:id="12"/>
+        <w:footnoteReference w:id="9"/>
+      </w:r>
+      <w:r>
+        <w:rPr/>
+        <w:t xml:space="preserve"> Farouk will argue that his </w:t>
+      </w:r>
+      <w:r>
+        <w:rPr>
+          <w:i/>
+          <w:iCs/>
+        </w:rPr>
+        <w:t>talaq</w:t>
+      </w:r>
+      <w:r>
+        <w:rPr/>
+        <w:t xml:space="preserve"> ended the marriage before any proceedings were instituted, so that paragraph (a) does not reach it.</w:t>
       </w:r>
     </w:p>
     <w:p>
@@ -992,15 +800,19 @@
         <w:rPr/>
       </w:pPr>
       <w:r>
-        <w:rPr>
-          <w:i/>
-          <w:iCs/>
-        </w:rPr>
-        <w:t>Farouk’s argument.</w:t>
-      </w:r>
-      <w:r>
-        <w:rPr/>
-        <w:t xml:space="preserve"> The </w:t>
+        <w:rPr/>
+        <w:t xml:space="preserve">This was the question in </w:t>
+      </w:r>
+      <w:r>
+        <w:rPr>
+          <w:i/>
+          <w:iCs/>
+        </w:rPr>
+        <w:t>H.A v N.A</w:t>
+      </w:r>
+      <w:r>
+        <w:rPr/>
+        <w:t xml:space="preserve">, where the husband issued </w:t>
       </w:r>
       <w:r>
         <w:rPr>
@@ -1011,7 +823,45 @@
       </w:r>
       <w:r>
         <w:rPr/>
-        <w:t xml:space="preserve"> ended the marriage under Islamic law before any proceedings were instituted. Paragraph (a) extends the Act to an Islamic termination only where proceedings are already pending, so the marriage is no longer “subsisting”.</w:t>
+        <w:t xml:space="preserve"> before the wife instituted proceedings. The court identified section 6 as central but left the question to the main action, so the case is authority neither way.</w:t>
+      </w:r>
+      <w:r>
+        <w:rPr>
+          <w:rStyle w:val="FootnoteReference"/>
+        </w:rPr>
+        <w:footnoteReference w:id="10"/>
+      </w:r>
+      <w:r>
+        <w:rPr/>
+        <w:t xml:space="preserve"> The Full Bench in </w:t>
+      </w:r>
+      <w:r>
+        <w:rPr>
+          <w:i/>
+          <w:iCs/>
+        </w:rPr>
+        <w:t>E.S v H.Z.A</w:t>
+      </w:r>
+      <w:r>
+        <w:rPr/>
+        <w:t xml:space="preserve"> has since held that the amended Act applies to Muslim marriages and that a prior </w:t>
+      </w:r>
+      <w:r>
+        <w:rPr>
+          <w:i/>
+          <w:iCs/>
+        </w:rPr>
+        <w:t>talaq</w:t>
+      </w:r>
+      <w:r>
+        <w:rPr/>
+        <w:t xml:space="preserve"> does not prevent a spouse from invoking the civil divorce process and Rule 43, rejecting any approach under which civil protection depends on which spouse acts first.</w:t>
+      </w:r>
+      <w:r>
+        <w:rPr>
+          <w:rStyle w:val="FootnoteReference"/>
+        </w:rPr>
+        <w:footnoteReference w:id="11"/>
       </w:r>
     </w:p>
     <w:p>
@@ -1019,135 +869,26 @@
         <w:pStyle w:val="BodyText"/>
         <w:rPr/>
       </w:pPr>
-      <w:r>
-        <w:rPr>
-          <w:i/>
-          <w:iCs/>
-        </w:rPr>
-        <w:t>The case law.</w:t>
-      </w:r>
-      <w:r>
-        <w:rPr/>
-        <w:t xml:space="preserve"> This was the question in </w:t>
-      </w:r>
-      <w:r>
-        <w:rPr>
-          <w:i/>
-          <w:iCs/>
-        </w:rPr>
-        <w:t>H.A v N.A</w:t>
-      </w:r>
-      <w:r>
-        <w:rPr/>
-        <w:t xml:space="preserve">, where the husband issued </w:t>
-      </w:r>
-      <w:r>
-        <w:rPr>
-          <w:i/>
-          <w:iCs/>
-        </w:rPr>
-        <w:t>talaq</w:t>
-      </w:r>
-      <w:r>
-        <w:rPr/>
-        <w:t xml:space="preserve"> before the wife instituted proceedings and argued that she was not a “spouse” entitled to Rule 43 relief. The court identified section 6 as central but declined to decide the question at the interlocutory stage, leaving it to the main action.</w:t>
-      </w:r>
-      <w:r>
-        <w:rPr>
-          <w:rStyle w:val="FootnoteReference"/>
-        </w:rPr>
-        <w:footnoteReference w:id="13"/>
-      </w:r>
-      <w:r>
-        <w:rPr/>
-        <w:t xml:space="preserve"> The case is therefore not authority that </w:t>
-      </w:r>
-      <w:r>
-        <w:rPr>
-          <w:i/>
-          <w:iCs/>
-        </w:rPr>
-        <w:t>talaq</w:t>
-      </w:r>
-      <w:r>
-        <w:rPr/>
-        <w:t xml:space="preserve"> ends a Muslim marriage for civil purposes, nor authority to the contrary. The Full Bench in </w:t>
-      </w:r>
-      <w:r>
-        <w:rPr>
-          <w:i/>
-          <w:iCs/>
-        </w:rPr>
-        <w:t>E.S v H.Z.A</w:t>
-      </w:r>
-      <w:r>
-        <w:rPr/>
-        <w:t xml:space="preserve"> has since held that the amended Act applies to Muslim marriages and that a prior </w:t>
-      </w:r>
-      <w:r>
-        <w:rPr>
-          <w:i/>
-          <w:iCs/>
-        </w:rPr>
-        <w:t>talaq</w:t>
-      </w:r>
-      <w:r>
-        <w:rPr/>
-        <w:t xml:space="preserve"> does not prevent a spouse from invoking the civil divorce process and Rule 43, “spouse” being read purposively.</w:t>
-      </w:r>
-      <w:r>
-        <w:rPr>
-          <w:rStyle w:val="FootnoteReference"/>
-        </w:rPr>
-        <w:footnoteReference w:id="14"/>
-      </w:r>
-      <w:r>
-        <w:rPr/>
-        <w:t xml:space="preserve"> It also rejected an approach under which civil protection depends on which spouse acts first.</w:t>
-      </w:r>
-    </w:p>
-    <w:p>
-      <w:pPr>
-        <w:pStyle w:val="BodyText"/>
-        <w:rPr/>
-      </w:pPr>
-      <w:r>
-        <w:rPr>
-          <w:i/>
-          <w:iCs/>
-        </w:rPr>
-        <w:t>Why Amina’s reading should prevail.</w:t>
-      </w:r>
-      <w:r>
-        <w:rPr/>
-        <w:t xml:space="preserve"> First, paragraph (b) is a separate limb, and the 2012 marriage subsisted on 15 December 2014. Farouk cannot rely on (a) while ignoring (b). Secondly, for civil-law purposes a marriage subsists until a decree is granted (section 3), so it is still a “subsisting” Muslim marriage, and paragraph (a) is best read as confirming that an Islamic termination does not remove a marriage from the Act. Thirdly, any timing difficulty can be cured. If Amina now issues summons, proceedings are “instituted but not yet finalised” and (a) is satisfied even on Farouk’s own reading; a rule that made the Act’s protection depend on who reaches court first would be arbitrary. Fourthly, the amendments to sections 6, 7 and 9 of the Divorce Act presuppose judicial involvement and would be defeated if a husband could avoid them by pronouncing </w:t>
-      </w:r>
-      <w:r>
-        <w:rPr>
-          <w:i/>
-          <w:iCs/>
-        </w:rPr>
-        <w:t>talaq</w:t>
-      </w:r>
-      <w:r>
-        <w:rPr/>
-        <w:t xml:space="preserve"> first.</w:t>
-      </w:r>
+      <w:bookmarkStart w:id="8" w:name="section-6"/>
+      <w:r>
+        <w:rPr/>
+        <w:t>Amina’s reading should prevail for three reasons. First, paragraph (b) is a separate limb, and a marriage concluded in 2012 subsisted on 15 December 2014. Secondly, because section 3 makes the decree the dissolving act, the marriage still “subsists” in civil law, and paragraph (a) confirms that an Islamic termination does not remove a marriage from the Act. Thirdly, any timing difficulty can be cured: if Amina now issues summons, proceedings are “instituted but not yet finalised” even on Farouk’s reading.</w:t>
+      </w:r>
+      <w:bookmarkEnd w:id="8"/>
+    </w:p>
+    <w:p>
+      <w:pPr>
+        <w:pStyle w:val="Heading2"/>
+        <w:rPr/>
+      </w:pPr>
+      <w:bookmarkStart w:id="9" w:name="__RefHeading___Toc953_3227372185"/>
+      <w:bookmarkStart w:id="10" w:name="application"/>
       <w:bookmarkEnd w:id="9"/>
-    </w:p>
-    <w:p>
-      <w:pPr>
-        <w:pStyle w:val="Heading2"/>
-        <w:rPr/>
-      </w:pPr>
-      <w:bookmarkStart w:id="10" w:name="__RefHeading___Toc1217_933187192"/>
-      <w:bookmarkStart w:id="11" w:name="application"/>
-      <w:bookmarkEnd w:id="10"/>
       <w:r>
         <w:rPr>
           <w:rStyle w:val="SectionNumber"/>
         </w:rPr>
-        <w:t>2.4</w:t>
+        <w:t>2.3</w:t>
       </w:r>
       <w:r>
         <w:rPr/>
@@ -1162,7 +903,7 @@
       </w:pPr>
       <w:r>
         <w:rPr/>
-        <w:t xml:space="preserve">Farouk’s </w:t>
+        <w:t xml:space="preserve">The </w:t>
       </w:r>
       <w:r>
         <w:rPr>
@@ -1173,7 +914,17 @@
       </w:r>
       <w:r>
         <w:rPr/>
-        <w:t xml:space="preserve"> was issued in March 2025, after commencement, so there is no retrospectivity problem. The court should refuse the declarator in its broad form. A declaratory order under section 21(1)(c) of the Superior Courts Act 10 of 2013 is discretionary, and it would be inappropriate to grant it to confirm a unilateral private act where the statute prescribes a judicial route and the other spouse opposes. The court should state that any religious consequences of the </w:t>
+        <w:t xml:space="preserve"> post-dates commencement, so retrospectivity does not arise. A declaratory order under section 21(1)(c) of the Superior Courts Act is discretionary,</w:t>
+      </w:r>
+      <w:r>
+        <w:rPr>
+          <w:rStyle w:val="FootnoteReference"/>
+        </w:rPr>
+        <w:footnoteReference w:id="12"/>
+      </w:r>
+      <w:r>
+        <w:rPr/>
+        <w:t xml:space="preserve"> and should not be granted to confirm a unilateral private act where the statute prescribes a judicial route and the other spouse opposes. The court should refuse the declarator, state that any religious consequences of the </w:t>
       </w:r>
       <w:r>
         <w:rPr>
@@ -1184,7 +935,7 @@
       </w:r>
       <w:r>
         <w:rPr/>
-        <w:t xml:space="preserve"> do not prevent it from determining the parties’ civil status, and leave Farouk free to institute or counterclaim for divorce, relying on the </w:t>
+        <w:t xml:space="preserve"> do not prevent it from determining the parties’ civil status, and leave Farouk free to seek a divorce, relying on the </w:t>
       </w:r>
       <w:r>
         <w:rPr>
@@ -1195,19 +946,19 @@
       </w:r>
       <w:r>
         <w:rPr/>
-        <w:t xml:space="preserve"> as evidence of irretrievable breakdown under section 4.</w:t>
+        <w:t xml:space="preserve"> as evidence of irretrievable breakdown.</w:t>
       </w:r>
       <w:bookmarkEnd w:id="3"/>
+      <w:bookmarkEnd w:id="10"/>
+    </w:p>
+    <w:p>
+      <w:pPr>
+        <w:pStyle w:val="Heading1"/>
+        <w:rPr/>
+      </w:pPr>
+      <w:bookmarkStart w:id="11" w:name="__RefHeading___Toc955_3227372185"/>
+      <w:bookmarkStart w:id="12" w:name="Xee589dd567013339000a545aadebc1fd688232b"/>
       <w:bookmarkEnd w:id="11"/>
-    </w:p>
-    <w:p>
-      <w:pPr>
-        <w:pStyle w:val="Heading1"/>
-        <w:rPr/>
-      </w:pPr>
-      <w:bookmarkStart w:id="12" w:name="__RefHeading___Toc1219_933187192"/>
-      <w:bookmarkStart w:id="13" w:name="Xee589dd567013339000a545aadebc1fd688232b"/>
-      <w:bookmarkEnd w:id="12"/>
       <w:r>
         <w:rPr>
           <w:rStyle w:val="SectionNumber"/>
@@ -1232,19 +983,125 @@
         <w:pStyle w:val="Heading2"/>
         <w:rPr/>
       </w:pPr>
-      <w:bookmarkStart w:id="14" w:name="__RefHeading___Toc1221_933187192"/>
-      <w:bookmarkStart w:id="15" w:name="equality-s-9"/>
+      <w:bookmarkStart w:id="13" w:name="__RefHeading___Toc957_3227372185"/>
+      <w:bookmarkStart w:id="14" w:name="equality-and-dignity"/>
+      <w:bookmarkEnd w:id="13"/>
+      <w:r>
+        <w:rPr>
+          <w:rStyle w:val="SectionNumber"/>
+        </w:rPr>
+        <w:t>3.1</w:t>
+      </w:r>
+      <w:r>
+        <w:rPr/>
+        <w:tab/>
+        <w:t>Equality and dignity</w:t>
+      </w:r>
+    </w:p>
+    <w:p>
+      <w:pPr>
+        <w:pStyle w:val="FirstParagraph"/>
+        <w:rPr/>
+      </w:pPr>
+      <w:r>
+        <w:rPr/>
+        <w:t xml:space="preserve">A power of repudiation that is traditionally the husband’s, with the wife confined to </w:t>
+      </w:r>
+      <w:r>
+        <w:rPr>
+          <w:i/>
+          <w:iCs/>
+        </w:rPr>
+        <w:t>khul‘</w:t>
+      </w:r>
+      <w:r>
+        <w:rPr/>
+        <w:t xml:space="preserve"> or </w:t>
+      </w:r>
+      <w:r>
+        <w:rPr>
+          <w:i/>
+          <w:iCs/>
+        </w:rPr>
+        <w:t>faskh</w:t>
+      </w:r>
+      <w:r>
+        <w:rPr/>
+        <w:t xml:space="preserve">, is differentiation on the listed grounds of sex and religion, presumed unfair under section 9(5) of the Constitution. On the </w:t>
+      </w:r>
+      <w:r>
+        <w:rPr>
+          <w:i/>
+          <w:iCs/>
+        </w:rPr>
+        <w:t>Harksen v Lane NO</w:t>
+      </w:r>
+      <w:r>
+        <w:rPr/>
+        <w:t xml:space="preserve"> test, impact on a historically disadvantaged group is decisive.</w:t>
+      </w:r>
+      <w:r>
+        <w:rPr>
+          <w:rStyle w:val="FootnoteReference"/>
+        </w:rPr>
+        <w:footnoteReference w:id="13"/>
+      </w:r>
+      <w:r>
+        <w:rPr/>
+        <w:t xml:space="preserve"> </w:t>
+      </w:r>
+      <w:r>
+        <w:rPr>
+          <w:i/>
+          <w:iCs/>
+        </w:rPr>
+        <w:t>Gumede</w:t>
+      </w:r>
+      <w:r>
+        <w:rPr/>
+        <w:t xml:space="preserve"> struck down the discriminatory proprietary regime of customary marriages, and </w:t>
+      </w:r>
+      <w:r>
+        <w:rPr>
+          <w:i/>
+          <w:iCs/>
+        </w:rPr>
+        <w:t>Mayelane</w:t>
+      </w:r>
+      <w:r>
+        <w:rPr/>
+        <w:t xml:space="preserve"> held that a status-altering act cannot be completed without the affected spouse’s participation.</w:t>
+      </w:r>
+      <w:r>
+        <w:rPr>
+          <w:rStyle w:val="FootnoteReference"/>
+        </w:rPr>
+        <w:footnoteReference w:id="14"/>
+      </w:r>
+      <w:r>
+        <w:rPr/>
+        <w:t xml:space="preserve"> These cases do not make Islamic law unconstitutional; they show that where a religious rule has civil consequences, those consequences must operate consistently with the Constitution. Repudiation without notice, hearing or reasons also treats a spouse as the object of a unilateral decision, which engages section 10.</w:t>
+      </w:r>
       <w:bookmarkEnd w:id="14"/>
+    </w:p>
+    <w:p>
+      <w:pPr>
+        <w:pStyle w:val="Heading2"/>
+        <w:rPr/>
+      </w:pPr>
+      <w:bookmarkStart w:id="15" w:name="__RefHeading___Toc959_3227372185"/>
+      <w:bookmarkStart w:id="16" w:name="religious-freedom"/>
+      <w:bookmarkEnd w:id="15"/>
       <w:r>
         <w:rPr>
           <w:rStyle w:val="SectionNumber"/>
         </w:rPr>
-        <w:t>3.1</w:t>
+        <w:t>3.2</w:t>
       </w:r>
       <w:r>
         <w:rPr/>
         <w:tab/>
-        <w:t>Equality (s 9)</w:t>
+        <w:t>Religious freedom</w:t>
       </w:r>
     </w:p>
     <w:p>
@@ -1254,40 +1111,18 @@
       </w:pPr>
       <w:r>
         <w:rPr/>
-        <w:t xml:space="preserve">A power of repudiation that is traditionally the husband’s, with the wife confined to </w:t>
-      </w:r>
-      <w:r>
-        <w:rPr>
-          <w:i/>
-          <w:iCs/>
-        </w:rPr>
-        <w:t>khul‘</w:t>
-      </w:r>
-      <w:r>
-        <w:rPr/>
-        <w:t xml:space="preserve"> or </w:t>
-      </w:r>
-      <w:r>
-        <w:rPr>
-          <w:i/>
-          <w:iCs/>
-        </w:rPr>
-        <w:t>faskh</w:t>
-      </w:r>
-      <w:r>
-        <w:rPr/>
-        <w:t xml:space="preserve">, is differentiation on the listed grounds of sex and religion, presumed unfair under section 9(5). On the </w:t>
-      </w:r>
-      <w:r>
-        <w:rPr>
-          <w:i/>
-          <w:iCs/>
-        </w:rPr>
-        <w:t>Harksen v Lane NO</w:t>
-      </w:r>
-      <w:r>
-        <w:rPr/>
-        <w:t xml:space="preserve"> test, the impact on a historically disadvantaged group is decisive.</w:t>
+        <w:t xml:space="preserve">This is Farouk’s strongest argument, and Mujuzi warns against reading the Act as if it abolished </w:t>
+      </w:r>
+      <w:r>
+        <w:rPr>
+          <w:i/>
+          <w:iCs/>
+        </w:rPr>
+        <w:t>talaq</w:t>
+      </w:r>
+      <w:r>
+        <w:rPr/>
+        <w:t>.</w:t>
       </w:r>
       <w:r>
         <w:rPr>
@@ -1297,18 +1132,18 @@
       </w:r>
       <w:r>
         <w:rPr/>
-        <w:t xml:space="preserve"> </w:t>
-      </w:r>
-      <w:r>
-        <w:rPr>
-          <w:i/>
-          <w:iCs/>
-        </w:rPr>
-        <w:t>President of the Republic of South Africa v Hugo</w:t>
-      </w:r>
-      <w:r>
-        <w:rPr/>
-        <w:t xml:space="preserve"> stresses that impact,</w:t>
+        <w:t xml:space="preserve"> But section 15(3) requires recognition of religious marriages to be consistent with the Constitution, and section 31(2) bars the exercise of community rights inconsistently with the Bill of Rights. </w:t>
+      </w:r>
+      <w:r>
+        <w:rPr>
+          <w:i/>
+          <w:iCs/>
+        </w:rPr>
+        <w:t>Christian Education South Africa v Minister of Education</w:t>
+      </w:r>
+      <w:r>
+        <w:rPr/>
+        <w:t xml:space="preserve"> confirms that religious freedom exists within the constitutional framework.</w:t>
       </w:r>
       <w:r>
         <w:rPr>
@@ -1318,70 +1153,39 @@
       </w:r>
       <w:r>
         <w:rPr/>
-        <w:t xml:space="preserve"> </w:t>
-      </w:r>
-      <w:r>
-        <w:rPr>
-          <w:i/>
-          <w:iCs/>
-        </w:rPr>
-        <w:t>Gumede v President of the Republic of South Africa</w:t>
-      </w:r>
-      <w:r>
-        <w:rPr/>
-        <w:t xml:space="preserve"> struck down the discriminatory proprietary regime of customary marriages,</w:t>
-      </w:r>
-      <w:r>
-        <w:rPr>
-          <w:rStyle w:val="FootnoteReference"/>
-        </w:rPr>
-        <w:footnoteReference w:id="17"/>
-      </w:r>
-      <w:r>
-        <w:rPr/>
-        <w:t xml:space="preserve"> and </w:t>
-      </w:r>
-      <w:r>
-        <w:rPr>
-          <w:i/>
-          <w:iCs/>
-        </w:rPr>
-        <w:t>Mayelane v Ngwenyama</w:t>
-      </w:r>
-      <w:r>
-        <w:rPr/>
-        <w:t xml:space="preserve"> held that a status-altering act cannot be completed without the affected spouse’s participation.</w:t>
-      </w:r>
-      <w:r>
-        <w:rPr>
-          <w:rStyle w:val="FootnoteReference"/>
-        </w:rPr>
-        <w:footnoteReference w:id="18"/>
-      </w:r>
-      <w:r>
-        <w:rPr/>
-        <w:t xml:space="preserve"> These cases do not make Islamic law unconstitutional; they show that where a religious rule has civil consequences, those consequences must operate consistently with the Constitution.</w:t>
-      </w:r>
-      <w:bookmarkEnd w:id="15"/>
+        <w:t xml:space="preserve"> It does not include a right to alter another person’s civil status without her participation. The court should accommodate: the </w:t>
+      </w:r>
+      <w:r>
+        <w:rPr>
+          <w:i/>
+          <w:iCs/>
+        </w:rPr>
+        <w:t>talaq</w:t>
+      </w:r>
+      <w:r>
+        <w:rPr/>
+        <w:t xml:space="preserve"> is recognised as a religious act, and its civil consequences remain governed by the Divorce Act.</w:t>
+      </w:r>
+      <w:bookmarkEnd w:id="16"/>
     </w:p>
     <w:p>
       <w:pPr>
         <w:pStyle w:val="Heading2"/>
         <w:rPr/>
       </w:pPr>
-      <w:bookmarkStart w:id="16" w:name="__RefHeading___Toc1223_933187192"/>
-      <w:bookmarkStart w:id="17" w:name="dignity-s-10"/>
-      <w:bookmarkEnd w:id="16"/>
+      <w:bookmarkStart w:id="17" w:name="__RefHeading___Toc961_3227372185"/>
+      <w:bookmarkStart w:id="18" w:name="access-to-courts-children-and-limitation"/>
+      <w:bookmarkEnd w:id="17"/>
       <w:r>
         <w:rPr>
           <w:rStyle w:val="SectionNumber"/>
         </w:rPr>
-        <w:t>3.2</w:t>
+        <w:t>3.3</w:t>
       </w:r>
       <w:r>
         <w:rPr/>
         <w:tab/>
-        <w:t>Dignity (s 10)</w:t>
+        <w:t>Access to courts, children and limitation</w:t>
       </w:r>
     </w:p>
     <w:p>
@@ -1391,7 +1195,7 @@
       </w:pPr>
       <w:r>
         <w:rPr/>
-        <w:t xml:space="preserve">Repudiation without notice, a hearing or reasons treats a spouse as the object of a unilateral decision, with practical consequences for the home, support and property. The correct question is not whether </w:t>
+        <w:t xml:space="preserve">Section 34 guarantees access to courts, and the 2024 amendments were designed to end the exclusion of Muslim spouses from them. Treating the </w:t>
       </w:r>
       <w:r>
         <w:rPr>
@@ -1402,220 +1206,52 @@
       </w:r>
       <w:r>
         <w:rPr/>
-        <w:t xml:space="preserve"> is itself unconstitutional but whether giving it automatic and complete civil effect, without judicial oversight, would undermine the rights of the affected spouse. It would.</w:t>
-      </w:r>
-      <w:bookmarkEnd w:id="17"/>
-    </w:p>
-    <w:p>
-      <w:pPr>
-        <w:pStyle w:val="Heading2"/>
-        <w:rPr/>
-      </w:pPr>
-      <w:bookmarkStart w:id="18" w:name="__RefHeading___Toc1225_933187192"/>
-      <w:bookmarkStart w:id="19" w:name="religious-freedom-ss-15-31"/>
+        <w:t xml:space="preserve"> as a bar would deprive Amina of the mechanisms designed to protect her. Section 28(2) makes children’s best interests paramount, and a unilateral </w:t>
+      </w:r>
+      <w:r>
+        <w:rPr>
+          <w:i/>
+          <w:iCs/>
+        </w:rPr>
+        <w:t>talaq</w:t>
+      </w:r>
+      <w:r>
+        <w:rPr/>
+        <w:t xml:space="preserve"> makes no provision for care, contact or maintenance. Section 39(2) requires an interpretation of section 6 that avoids recreating the exclusion identified in </w:t>
+      </w:r>
+      <w:r>
+        <w:rPr>
+          <w:i/>
+          <w:iCs/>
+        </w:rPr>
+        <w:t>WLCT</w:t>
+      </w:r>
+      <w:r>
+        <w:rPr/>
+        <w:t xml:space="preserve">. Any limitation of Farouk’s religious freedom is justifiable under section 36: the purpose is compelling, the limitation is modest because only the civil effect of the </w:t>
+      </w:r>
+      <w:r>
+        <w:rPr>
+          <w:i/>
+          <w:iCs/>
+        </w:rPr>
+        <w:t>talaq</w:t>
+      </w:r>
+      <w:r>
+        <w:rPr/>
+        <w:t xml:space="preserve"> is withheld, and no less restrictive means would protect the vulnerable spouse.</w:t>
+      </w:r>
+      <w:bookmarkEnd w:id="12"/>
       <w:bookmarkEnd w:id="18"/>
-      <w:r>
-        <w:rPr>
-          <w:rStyle w:val="SectionNumber"/>
-        </w:rPr>
-        <w:t>3.3</w:t>
-      </w:r>
-      <w:r>
-        <w:rPr/>
-        <w:tab/>
-        <w:t>Religious freedom (ss 15, 31)</w:t>
-      </w:r>
-    </w:p>
-    <w:p>
-      <w:pPr>
-        <w:pStyle w:val="FirstParagraph"/>
-        <w:rPr/>
-      </w:pPr>
-      <w:r>
-        <w:rPr/>
-        <w:t xml:space="preserve">This is Farouk’s strongest argument, and Mujuzi warns against reading the Act as if it abolished </w:t>
-      </w:r>
-      <w:r>
-        <w:rPr>
-          <w:i/>
-          <w:iCs/>
-        </w:rPr>
-        <w:t>talaq</w:t>
-      </w:r>
-      <w:r>
-        <w:rPr/>
-        <w:t>.</w:t>
-      </w:r>
-      <w:r>
-        <w:rPr>
-          <w:rStyle w:val="FootnoteReference"/>
-        </w:rPr>
-        <w:footnoteReference w:id="19"/>
-      </w:r>
-      <w:r>
-        <w:rPr/>
-        <w:t xml:space="preserve"> Section 15(3) contemplates recognition of marriages under religious law but requires consistency with the Constitution, and section 31(2) bars the exercise of community rights inconsistently with the Bill of Rights. </w:t>
-      </w:r>
-      <w:r>
-        <w:rPr>
-          <w:i/>
-          <w:iCs/>
-        </w:rPr>
-        <w:t>Christian Education South Africa v Minister of Education</w:t>
-      </w:r>
-      <w:r>
-        <w:rPr/>
-        <w:t xml:space="preserve"> recognises the importance of religious freedom while confirming that it exists within the constitutional framework.</w:t>
-      </w:r>
-      <w:r>
-        <w:rPr>
-          <w:rStyle w:val="FootnoteReference"/>
-        </w:rPr>
-        <w:footnoteReference w:id="20"/>
-      </w:r>
-      <w:r>
-        <w:rPr/>
-        <w:t xml:space="preserve"> The right to practise one’s religion does not include a right to alter another person’s civil status without her participation. The court should therefore accommodate: the </w:t>
-      </w:r>
-      <w:r>
-        <w:rPr>
-          <w:i/>
-          <w:iCs/>
-        </w:rPr>
-        <w:t>talaq</w:t>
-      </w:r>
-      <w:r>
-        <w:rPr/>
-        <w:t xml:space="preserve"> is recognised as a religious act, and the civil consequences remain governed by the Divorce Act.</w:t>
-      </w:r>
+    </w:p>
+    <w:p>
+      <w:pPr>
+        <w:pStyle w:val="Heading1"/>
+        <w:rPr/>
+      </w:pPr>
+      <w:bookmarkStart w:id="19" w:name="__RefHeading___Toc963_3227372185"/>
+      <w:bookmarkStart w:id="20" w:name="practical-and-doctrinal-challenges"/>
       <w:bookmarkEnd w:id="19"/>
-    </w:p>
-    <w:p>
-      <w:pPr>
-        <w:pStyle w:val="Heading2"/>
-        <w:rPr/>
-      </w:pPr>
-      <w:bookmarkStart w:id="20" w:name="__RefHeading___Toc1227_933187192"/>
-      <w:bookmarkStart w:id="21" w:name="access-to-courts-and-children-ss-34-28"/>
-      <w:bookmarkEnd w:id="20"/>
-      <w:r>
-        <w:rPr>
-          <w:rStyle w:val="SectionNumber"/>
-        </w:rPr>
-        <w:t>3.4</w:t>
-      </w:r>
-      <w:r>
-        <w:rPr/>
-        <w:tab/>
-        <w:t>Access to courts and children (ss 34, 28)</w:t>
-      </w:r>
-    </w:p>
-    <w:p>
-      <w:pPr>
-        <w:pStyle w:val="FirstParagraph"/>
-        <w:rPr/>
-      </w:pPr>
-      <w:r>
-        <w:rPr/>
-        <w:t xml:space="preserve">Section 34 guarantees access to courts, and the 2024 amendments were designed to end the exclusion of Muslim spouses from them. Treating the </w:t>
-      </w:r>
-      <w:r>
-        <w:rPr>
-          <w:i/>
-          <w:iCs/>
-        </w:rPr>
-        <w:t>talaq</w:t>
-      </w:r>
-      <w:r>
-        <w:rPr/>
-        <w:t xml:space="preserve"> as barring Amina from court would deprive her of the very mechanisms designed to protect her. Section 28(2) makes children’s best interests paramount, and the Amendment Act extended section 6 of the Divorce Act to children of Muslim marriages, whereas a unilateral </w:t>
-      </w:r>
-      <w:r>
-        <w:rPr>
-          <w:i/>
-          <w:iCs/>
-        </w:rPr>
-        <w:t>talaq</w:t>
-      </w:r>
-      <w:r>
-        <w:rPr/>
-        <w:t xml:space="preserve"> makes no provision for care, contact or maintenance.</w:t>
-      </w:r>
-      <w:bookmarkEnd w:id="21"/>
-    </w:p>
-    <w:p>
-      <w:pPr>
-        <w:pStyle w:val="Heading2"/>
-        <w:rPr/>
-      </w:pPr>
-      <w:bookmarkStart w:id="22" w:name="__RefHeading___Toc1229_933187192"/>
-      <w:bookmarkStart w:id="23" w:name="interpretation-and-limitation-ss-392-36"/>
-      <w:bookmarkEnd w:id="22"/>
-      <w:r>
-        <w:rPr>
-          <w:rStyle w:val="SectionNumber"/>
-        </w:rPr>
-        <w:t>3.5</w:t>
-      </w:r>
-      <w:r>
-        <w:rPr/>
-        <w:tab/>
-        <w:t>Interpretation and limitation (ss 39(2), 36)</w:t>
-      </w:r>
-    </w:p>
-    <w:p>
-      <w:pPr>
-        <w:pStyle w:val="FirstParagraph"/>
-        <w:rPr/>
-      </w:pPr>
-      <w:r>
-        <w:rPr/>
-        <w:t xml:space="preserve">Section 39(2) requires an interpretation of section 6 that avoids recreating the exclusion identified in </w:t>
-      </w:r>
-      <w:r>
-        <w:rPr>
-          <w:i/>
-          <w:iCs/>
-        </w:rPr>
-        <w:t>WLCT</w:t>
-      </w:r>
-      <w:r>
-        <w:rPr/>
-        <w:t xml:space="preserve">. If requiring the judicial route limits Farouk’s religious freedom, the limitation is justified under section 36: its purpose (equality, dignity, access to courts and the protection of vulnerable spouses and children) is compelling, it is closely related to that purpose, and it is modest in extent because only the civil effect of the </w:t>
-      </w:r>
-      <w:r>
-        <w:rPr>
-          <w:i/>
-          <w:iCs/>
-        </w:rPr>
-        <w:t>talaq</w:t>
-      </w:r>
-      <w:r>
-        <w:rPr/>
-        <w:t xml:space="preserve"> is withheld. There is no less restrictive means, since unsupervised unilateral </w:t>
-      </w:r>
-      <w:r>
-        <w:rPr>
-          <w:i/>
-          <w:iCs/>
-        </w:rPr>
-        <w:t>talaq</w:t>
-      </w:r>
-      <w:r>
-        <w:rPr/>
-        <w:t xml:space="preserve"> would leave the vulnerability intact.</w:t>
-      </w:r>
-      <w:bookmarkEnd w:id="13"/>
-      <w:bookmarkEnd w:id="23"/>
-    </w:p>
-    <w:p>
-      <w:pPr>
-        <w:pStyle w:val="Heading1"/>
-        <w:rPr/>
-      </w:pPr>
-      <w:bookmarkStart w:id="24" w:name="__RefHeading___Toc1231_933187192"/>
-      <w:bookmarkStart w:id="25" w:name="practical-and-doctrinal-challenges"/>
-      <w:bookmarkEnd w:id="24"/>
       <w:r>
         <w:rPr>
           <w:rStyle w:val="SectionNumber"/>
@@ -1635,17 +1271,193 @@
       </w:pPr>
       <w:r>
         <w:rPr/>
-        <w:t>The principal challenge is that two legal systems operate at once. Osman-Hyder shows that the absence of formal regulation exposed Muslim spouses to abuse and inadequate protection.</w:t>
+        <w:t>The principal challenge is that two legal systems operate at once. Osman-Hyder shows that the absence of regulation exposed Muslim spouses to abuse,</w:t>
       </w:r>
       <w:r>
         <w:rPr>
           <w:rStyle w:val="FootnoteReference"/>
         </w:rPr>
+        <w:footnoteReference w:id="17"/>
+      </w:r>
+      <w:r>
+        <w:rPr/>
+        <w:t xml:space="preserve"> Moosa and Rautenbach discuss, in Heaton’s collection, how religious dissolution may be integrated into the civil framework,</w:t>
+      </w:r>
+      <w:r>
+        <w:rPr>
+          <w:rStyle w:val="FootnoteReference"/>
+        </w:rPr>
+        <w:footnoteReference w:id="18"/>
+      </w:r>
+      <w:r>
+        <w:rPr/>
+        <w:t xml:space="preserve"> and Amien argues that the task is to decide which consequences belong to the religious sphere and which to civil law.</w:t>
+      </w:r>
+      <w:r>
+        <w:rPr>
+          <w:rStyle w:val="FootnoteReference"/>
+        </w:rPr>
+        <w:footnoteReference w:id="19"/>
+      </w:r>
+    </w:p>
+    <w:p>
+      <w:pPr>
+        <w:pStyle w:val="BodyText"/>
+        <w:rPr/>
+      </w:pPr>
+      <w:r>
+        <w:rPr/>
+        <w:t xml:space="preserve">Three difficulties follow. First, gender asymmetry: if the husband may terminate unilaterally while the wife must seek </w:t>
+      </w:r>
+      <w:r>
+        <w:rPr>
+          <w:i/>
+          <w:iCs/>
+        </w:rPr>
+        <w:t>khul‘</w:t>
+      </w:r>
+      <w:r>
+        <w:rPr/>
+        <w:t xml:space="preserve"> or </w:t>
+      </w:r>
+      <w:r>
+        <w:rPr>
+          <w:i/>
+          <w:iCs/>
+        </w:rPr>
+        <w:t>faskh</w:t>
+      </w:r>
+      <w:r>
+        <w:rPr/>
+        <w:t xml:space="preserve">, treating </w:t>
+      </w:r>
+      <w:r>
+        <w:rPr>
+          <w:i/>
+          <w:iCs/>
+        </w:rPr>
+        <w:t>talaq</w:t>
+      </w:r>
+      <w:r>
+        <w:rPr/>
+        <w:t xml:space="preserve"> as ending all civil consequences would entrench unequal protection. Secondly, dual status: a spouse may be divorced in one sphere and married in the other, as Amina is. Section 5A of the Divorce Act is the bridge, because it allows a court to refuse a decree until a religious barrier to remarriage is removed.</w:t>
+      </w:r>
+      <w:r>
+        <w:rPr>
+          <w:rStyle w:val="FootnoteReference"/>
+        </w:rPr>
+        <w:footnoteReference w:id="20"/>
+      </w:r>
+      <w:r>
+        <w:rPr/>
+        <w:t xml:space="preserve"> Thirdly, property: on divorce of a Muslim marriage the court may order the transfer of assets between the spouses, and the order must be just and equitable, having regard to direct and indirect contributions.</w:t>
+      </w:r>
+      <w:r>
+        <w:rPr>
+          <w:rStyle w:val="FootnoteReference"/>
+        </w:rPr>
         <w:footnoteReference w:id="21"/>
       </w:r>
       <w:r>
         <w:rPr/>
-        <w:t xml:space="preserve"> Moosa and Rautenbach, in Heaton’s collection, discuss the integration of religious dissolution into the civil framework,</w:t>
+        <w:t xml:space="preserve"> These protections would be defeated if a unilateral </w:t>
+      </w:r>
+      <w:r>
+        <w:rPr>
+          <w:i/>
+          <w:iCs/>
+        </w:rPr>
+        <w:t>talaq</w:t>
+      </w:r>
+      <w:r>
+        <w:rPr/>
+        <w:t xml:space="preserve"> ended every civil consequence before the court could consider them.</w:t>
+      </w:r>
+      <w:bookmarkEnd w:id="20"/>
+    </w:p>
+    <w:p>
+      <w:pPr>
+        <w:pStyle w:val="Heading1"/>
+        <w:rPr/>
+      </w:pPr>
+      <w:bookmarkStart w:id="21" w:name="__RefHeading___Toc965_3227372185"/>
+      <w:bookmarkStart w:id="22" w:name="X86e32ac461fbdb95b998a0f80996f305752e06d"/>
+      <w:bookmarkEnd w:id="21"/>
+      <w:r>
+        <w:rPr>
+          <w:rStyle w:val="SectionNumber"/>
+        </w:rPr>
+        <w:t>5</w:t>
+      </w:r>
+      <w:r>
+        <w:rPr/>
+        <w:tab/>
+        <w:t>Interpretation, counterarguments and order</w:t>
+      </w:r>
+    </w:p>
+    <w:p>
+      <w:pPr>
+        <w:pStyle w:val="FirstParagraph"/>
+        <w:rPr/>
+      </w:pPr>
+      <w:r>
+        <w:rPr/>
+        <w:t xml:space="preserve">Farouk will say that the Act does not expressly abolish </w:t>
+      </w:r>
+      <w:r>
+        <w:rPr>
+          <w:i/>
+          <w:iCs/>
+        </w:rPr>
+        <w:t>talaq</w:t>
+      </w:r>
+      <w:r>
+        <w:rPr/>
+        <w:t xml:space="preserve">, that section 15 protects religious practice, and that section 6(a) itself refers to marriages terminated under Islamic tenets. The point has force, but it does not follow that a </w:t>
+      </w:r>
+      <w:r>
+        <w:rPr>
+          <w:i/>
+          <w:iCs/>
+        </w:rPr>
+        <w:t>talaq</w:t>
+      </w:r>
+      <w:r>
+        <w:rPr/>
+        <w:t xml:space="preserve"> deprives Amina of her civil-law rights. Section 3 provides for dissolution by decree, section 6(b) covers the 2012 marriage, the Act’s protections for children, property and forfeiture would be frustrated if a spouse could avoid them by pronouncing </w:t>
+      </w:r>
+      <w:r>
+        <w:rPr>
+          <w:i/>
+          <w:iCs/>
+        </w:rPr>
+        <w:t>talaq</w:t>
+      </w:r>
+      <w:r>
+        <w:rPr/>
+        <w:t xml:space="preserve">, and </w:t>
+      </w:r>
+      <w:r>
+        <w:rPr>
+          <w:i/>
+          <w:iCs/>
+        </w:rPr>
+        <w:t>E.S v H.Z.A</w:t>
+      </w:r>
+      <w:r>
+        <w:rPr/>
+        <w:t xml:space="preserve"> is authority that a prior </w:t>
+      </w:r>
+      <w:r>
+        <w:rPr>
+          <w:i/>
+          <w:iCs/>
+        </w:rPr>
+        <w:t>talaq</w:t>
+      </w:r>
+      <w:r>
+        <w:rPr/>
+        <w:t xml:space="preserve"> does not bar civil divorce or Rule 43 relief.</w:t>
       </w:r>
       <w:r>
         <w:rPr>
@@ -1655,7 +1467,39 @@
       </w:r>
       <w:r>
         <w:rPr/>
-        <w:t xml:space="preserve"> and Amien highlights the tension between recognition, religious autonomy and the protection of Muslim women’s rights, arguing that the task is to decide which consequences belong to the religious sphere and which to civil law.</w:t>
+        <w:t xml:space="preserve"> Section 39(2) points the same way. Distinguishing religious from civil dissolution also serves legal certainty, because the marriage ends by one public and provable act, a decree.</w:t>
+      </w:r>
+    </w:p>
+    <w:p>
+      <w:pPr>
+        <w:pStyle w:val="BodyText"/>
+        <w:rPr/>
+      </w:pPr>
+      <w:r>
+        <w:rPr/>
+        <w:t xml:space="preserve">Amina can issue summons, which disposes of the section 6(a) argument; </w:t>
+      </w:r>
+      <w:r>
+        <w:rPr>
+          <w:i/>
+          <w:iCs/>
+        </w:rPr>
+        <w:t>S.W v A.L</w:t>
+      </w:r>
+      <w:r>
+        <w:rPr/>
+        <w:t xml:space="preserve"> illustrates that a </w:t>
+      </w:r>
+      <w:r>
+        <w:rPr>
+          <w:i/>
+          <w:iCs/>
+        </w:rPr>
+        <w:t>talaq</w:t>
+      </w:r>
+      <w:r>
+        <w:rPr/>
+        <w:t xml:space="preserve"> does not render divorce proceedings or Rule 43 relief moot.</w:t>
       </w:r>
       <w:r>
         <w:rPr>
@@ -1663,401 +1507,26 @@
         </w:rPr>
         <w:footnoteReference w:id="23"/>
       </w:r>
-    </w:p>
-    <w:p>
-      <w:pPr>
-        <w:pStyle w:val="BodyText"/>
-        <w:rPr/>
-      </w:pPr>
-      <w:r>
-        <w:rPr>
-          <w:i/>
-          <w:iCs/>
-        </w:rPr>
-        <w:t>Gender asymmetry.</w:t>
-      </w:r>
-      <w:r>
-        <w:rPr/>
-        <w:t xml:space="preserve"> If the husband may terminate unilaterally while the wife must seek </w:t>
-      </w:r>
-      <w:r>
-        <w:rPr>
-          <w:i/>
-          <w:iCs/>
-        </w:rPr>
-        <w:t>khul‘</w:t>
-      </w:r>
-      <w:r>
-        <w:rPr/>
-        <w:t xml:space="preserve"> (often involving return of the </w:t>
-      </w:r>
-      <w:r>
-        <w:rPr>
-          <w:i/>
-          <w:iCs/>
-        </w:rPr>
-        <w:t>mahr</w:t>
-      </w:r>
-      <w:r>
-        <w:rPr/>
-        <w:t xml:space="preserve">) or </w:t>
-      </w:r>
-      <w:r>
-        <w:rPr>
-          <w:i/>
-          <w:iCs/>
-        </w:rPr>
-        <w:t>faskh</w:t>
-      </w:r>
-      <w:r>
-        <w:rPr/>
-        <w:t xml:space="preserve">, treating </w:t>
-      </w:r>
-      <w:r>
-        <w:rPr>
-          <w:i/>
-          <w:iCs/>
-        </w:rPr>
-        <w:t>talaq</w:t>
-      </w:r>
-      <w:r>
-        <w:rPr/>
-        <w:t xml:space="preserve"> as ending all civil consequences would entrench unequal protection.</w:t>
-      </w:r>
-    </w:p>
-    <w:p>
-      <w:pPr>
-        <w:pStyle w:val="BodyText"/>
-        <w:rPr/>
-      </w:pPr>
-      <w:r>
-        <w:rPr>
-          <w:i/>
-          <w:iCs/>
-        </w:rPr>
-        <w:t>Dual status.</w:t>
-      </w:r>
-      <w:r>
-        <w:rPr/>
-        <w:t xml:space="preserve"> A spouse may be divorced in one sphere and married in the other, as Amina is. The risks include a husband remarrying religiously while the first marriage subsists, and a wife being unable to remarry in her community if he withholds cooperation. Section 5A of the Divorce Act is the bridge: a court may refuse a decree until a religious barrier to remarriage is removed, so Farouk cannot obtain a civil decree and leave Amina in religious limbo.</w:t>
-      </w:r>
-      <w:r>
-        <w:rPr>
-          <w:rStyle w:val="FootnoteReference"/>
-        </w:rPr>
-        <w:footnoteReference w:id="24"/>
-      </w:r>
-    </w:p>
-    <w:p>
-      <w:pPr>
-        <w:pStyle w:val="BodyText"/>
-        <w:rPr/>
-      </w:pPr>
-      <w:r>
-        <w:rPr>
-          <w:i/>
-          <w:iCs/>
-        </w:rPr>
-        <w:t>Property.</w:t>
-      </w:r>
-      <w:r>
-        <w:rPr/>
-        <w:t xml:space="preserve"> Section 7(3A) allows the court, on divorce of a Muslim marriage and absent agreement, to order the transfer of assets between the spouses, and section 7(4) requires the order to be just and equitable, having regard to direct and indirect contributions.</w:t>
-      </w:r>
-      <w:r>
-        <w:rPr>
-          <w:rStyle w:val="FootnoteReference"/>
-        </w:rPr>
-        <w:footnoteReference w:id="25"/>
-      </w:r>
-      <w:r>
-        <w:rPr/>
-        <w:t xml:space="preserve"> Section 7(5) allows the court to consider an agreement where the husband is party to more than one Muslim marriage.</w:t>
-      </w:r>
-      <w:r>
-        <w:rPr>
-          <w:rStyle w:val="FootnoteReference"/>
-        </w:rPr>
-        <w:footnoteReference w:id="26"/>
-      </w:r>
-      <w:r>
-        <w:rPr/>
-        <w:t xml:space="preserve"> These protections would be defeated if a unilateral </w:t>
-      </w:r>
-      <w:r>
-        <w:rPr>
-          <w:i/>
-          <w:iCs/>
-        </w:rPr>
-        <w:t>talaq</w:t>
-      </w:r>
-      <w:r>
-        <w:rPr/>
-        <w:t xml:space="preserve"> ended every civil consequence before the court could consider them. Heaton’s treatment of the patrimonial consequences of divorce also notes the debate about the constitutionality of the court’s redistribution power under section 7(3) for civil marriages.</w:t>
-      </w:r>
-      <w:r>
-        <w:rPr>
-          <w:rStyle w:val="FootnoteReference"/>
-        </w:rPr>
-        <w:footnoteReference w:id="27"/>
-      </w:r>
-    </w:p>
-    <w:p>
-      <w:pPr>
-        <w:pStyle w:val="BodyText"/>
-        <w:rPr/>
-      </w:pPr>
-      <w:r>
-        <w:rPr>
-          <w:i/>
-          <w:iCs/>
-        </w:rPr>
-        <w:t>Proof and doctrine.</w:t>
-      </w:r>
-      <w:r>
-        <w:rPr/>
-        <w:t xml:space="preserve"> The existence of a marriage and of a </w:t>
-      </w:r>
-      <w:r>
-        <w:rPr>
-          <w:i/>
-          <w:iCs/>
-        </w:rPr>
-        <w:t>talaq</w:t>
-      </w:r>
-      <w:r>
-        <w:rPr/>
-        <w:t>, and the school of law that governs, are difficult to prove, which is a further reason for the court to confine itself to civil effect and not adjudicate religious validity.</w:t>
-      </w:r>
-      <w:bookmarkEnd w:id="25"/>
+      <w:r>
+        <w:rPr/>
+        <w:t xml:space="preserve"> She can claim interim maintenance and a contribution to costs, and her continued occupation of the home is protected by section 26(3) of the Constitution, which bars eviction without a court order.</w:t>
+      </w:r>
+      <w:bookmarkEnd w:id="22"/>
     </w:p>
     <w:p>
       <w:pPr>
         <w:pStyle w:val="Heading1"/>
         <w:rPr/>
       </w:pPr>
-      <w:bookmarkStart w:id="26" w:name="__RefHeading___Toc1233_933187192"/>
-      <w:bookmarkStart w:id="27" w:name="X2c78ccdf42f68fc5ff09330797eb15297bf239b"/>
-      <w:bookmarkEnd w:id="26"/>
+      <w:bookmarkStart w:id="23" w:name="__RefHeading___Toc967_3227372185"/>
+      <w:bookmarkStart w:id="24" w:name="conclusion"/>
+      <w:bookmarkEnd w:id="23"/>
+      <w:bookmarkEnd w:id="24"/>
       <w:r>
         <w:rPr>
           <w:rStyle w:val="SectionNumber"/>
         </w:rPr>
-        <w:t>5</w:t>
-      </w:r>
-      <w:r>
-        <w:rPr/>
-        <w:tab/>
-        <w:t>Counterarguments and the proper interpretation</w:t>
-      </w:r>
-    </w:p>
-    <w:p>
-      <w:pPr>
-        <w:pStyle w:val="FirstParagraph"/>
-        <w:rPr/>
-      </w:pPr>
-      <w:r>
-        <w:rPr/>
-        <w:t xml:space="preserve">Farouk will say the Act does not expressly abolish </w:t>
-      </w:r>
-      <w:r>
-        <w:rPr>
-          <w:i/>
-          <w:iCs/>
-        </w:rPr>
-        <w:t>talaq</w:t>
-      </w:r>
-      <w:r>
-        <w:rPr/>
-        <w:t xml:space="preserve">, that section 15 protects religious practice, and that section 6(a) itself refers to marriages terminated under Islamic tenets, so Parliament intended to recognise the religious termination and add civil remedies. Mujuzi’s argument that reading the Act as abolishing </w:t>
-      </w:r>
-      <w:r>
-        <w:rPr>
-          <w:i/>
-          <w:iCs/>
-        </w:rPr>
-        <w:t>talaq</w:t>
-      </w:r>
-      <w:r>
-        <w:rPr/>
-        <w:t xml:space="preserve"> could raise its own equality and religious-freedom concerns shows the point has force.</w:t>
-      </w:r>
-      <w:r>
-        <w:rPr>
-          <w:rStyle w:val="FootnoteReference"/>
-        </w:rPr>
-        <w:footnoteReference w:id="28"/>
-      </w:r>
-      <w:r>
-        <w:rPr/>
-        <w:t xml:space="preserve"> But it does not follow that a </w:t>
-      </w:r>
-      <w:r>
-        <w:rPr>
-          <w:i/>
-          <w:iCs/>
-        </w:rPr>
-        <w:t>talaq</w:t>
-      </w:r>
-      <w:r>
-        <w:rPr/>
-        <w:t xml:space="preserve"> deprives Amina of her civil-law rights. Section 3 provides for dissolution by decree. Section 6(b) covers the 2012 marriage, which subsists until a decree. The Act’s protections for children, property and forfeiture would be frustrated if a spouse could avoid them by pronouncing </w:t>
-      </w:r>
-      <w:r>
-        <w:rPr>
-          <w:i/>
-          <w:iCs/>
-        </w:rPr>
-        <w:t>talaq</w:t>
-      </w:r>
-      <w:r>
-        <w:rPr/>
-        <w:t xml:space="preserve">. </w:t>
-      </w:r>
-      <w:r>
-        <w:rPr>
-          <w:i/>
-          <w:iCs/>
-        </w:rPr>
-        <w:t>E.S v H.Z.A</w:t>
-      </w:r>
-      <w:r>
-        <w:rPr/>
-        <w:t xml:space="preserve"> is post-amendment authority that a prior </w:t>
-      </w:r>
-      <w:r>
-        <w:rPr>
-          <w:i/>
-          <w:iCs/>
-        </w:rPr>
-        <w:t>talaq</w:t>
-      </w:r>
-      <w:r>
-        <w:rPr/>
-        <w:t xml:space="preserve"> does not bar civil divorce or Rule 43 relief. And section 39(2) requires the reading that promotes equality and access to justice while accommodating religion.</w:t>
-      </w:r>
-    </w:p>
-    <w:p>
-      <w:pPr>
-        <w:pStyle w:val="BodyText"/>
-        <w:rPr/>
-      </w:pPr>
-      <w:bookmarkStart w:id="28" w:name="X2c78ccdf42f68fc5ff09330797eb15297bf239b"/>
-      <w:r>
-        <w:rPr/>
-        <w:t>The court should therefore distinguish religious dissolution from civil dissolution. This best advances legal certainty, since the marriage ends by one public and provable act, a decree, on which pension funds, insurers and the Master can rely, and it respects religious freedom by leaving questions of religious validity to the religious community.</w:t>
-      </w:r>
-      <w:bookmarkEnd w:id="28"/>
-    </w:p>
-    <w:p>
-      <w:pPr>
-        <w:pStyle w:val="Heading1"/>
-        <w:rPr/>
-      </w:pPr>
-      <w:bookmarkStart w:id="29" w:name="__RefHeading___Toc1235_933187192"/>
-      <w:bookmarkStart w:id="30" w:name="remedies-and-order"/>
-      <w:bookmarkEnd w:id="29"/>
-      <w:r>
-        <w:rPr>
-          <w:rStyle w:val="SectionNumber"/>
-        </w:rPr>
         <w:t>6</w:t>
-      </w:r>
-      <w:r>
-        <w:rPr/>
-        <w:tab/>
-        <w:t>Remedies and order</w:t>
-      </w:r>
-    </w:p>
-    <w:p>
-      <w:pPr>
-        <w:pStyle w:val="FirstParagraph"/>
-        <w:rPr/>
-      </w:pPr>
-      <w:r>
-        <w:rPr/>
-        <w:t xml:space="preserve">Amina can issue summons for divorce, which also disposes of the section 6(a) argument; </w:t>
-      </w:r>
-      <w:r>
-        <w:rPr>
-          <w:i/>
-          <w:iCs/>
-        </w:rPr>
-        <w:t>S.W v A.L</w:t>
-      </w:r>
-      <w:r>
-        <w:rPr/>
-        <w:t xml:space="preserve"> illustrates that a </w:t>
-      </w:r>
-      <w:r>
-        <w:rPr>
-          <w:i/>
-          <w:iCs/>
-        </w:rPr>
-        <w:t>talaq</w:t>
-      </w:r>
-      <w:r>
-        <w:rPr/>
-        <w:t xml:space="preserve"> does not render divorce proceedings or Rule 43 relief moot.</w:t>
-      </w:r>
-      <w:r>
-        <w:rPr>
-          <w:rStyle w:val="FootnoteReference"/>
-        </w:rPr>
-        <w:footnoteReference w:id="29"/>
-      </w:r>
-      <w:r>
-        <w:rPr/>
-        <w:t xml:space="preserve"> She can claim interim maintenance and a contribution to costs under Rule 43, the importance of which was recognised in </w:t>
-      </w:r>
-      <w:r>
-        <w:rPr>
-          <w:i/>
-          <w:iCs/>
-        </w:rPr>
-        <w:t>H.A v N.A</w:t>
-      </w:r>
-      <w:r>
-        <w:rPr/>
-        <w:t xml:space="preserve"> and confirmed in </w:t>
-      </w:r>
-      <w:r>
-        <w:rPr>
-          <w:i/>
-          <w:iCs/>
-        </w:rPr>
-        <w:t>E.S v H.Z.A</w:t>
-      </w:r>
-      <w:r>
-        <w:rPr/>
-        <w:t>. Her continued occupation of the home is protected by section 26(3) of the Constitution, which bars eviction without a court order, and Sonnekus’s chapter in Heaton (ed) confirms that occupation claims on divorce are for the court.</w:t>
-      </w:r>
-      <w:r>
-        <w:rPr>
-          <w:rStyle w:val="FootnoteReference"/>
-        </w:rPr>
-        <w:footnoteReference w:id="30"/>
-      </w:r>
-      <w:r>
-        <w:rPr/>
-        <w:t xml:space="preserve"> She can also claim maintenance under section 7(2) and redistribution under sections 7(3A) and 7(4).</w:t>
-      </w:r>
-      <w:bookmarkEnd w:id="30"/>
-    </w:p>
-    <w:p>
-      <w:pPr>
-        <w:pStyle w:val="Heading1"/>
-        <w:rPr/>
-      </w:pPr>
-      <w:bookmarkStart w:id="31" w:name="__RefHeading___Toc1237_933187192"/>
-      <w:bookmarkStart w:id="32" w:name="conclusion"/>
-      <w:bookmarkEnd w:id="31"/>
-      <w:bookmarkEnd w:id="32"/>
-      <w:r>
-        <w:rPr>
-          <w:rStyle w:val="SectionNumber"/>
-        </w:rPr>
-        <w:t>7</w:t>
       </w:r>
       <w:r>
         <w:rPr/>
@@ -2072,7 +1541,7 @@
       </w:pPr>
       <w:r>
         <w:rPr/>
-        <w:t xml:space="preserve">Amina and Farouk’s marriage is a Muslim marriage within the amended Divorce Act and subsisted on 15 December 2014. The better view is that the </w:t>
+        <w:t xml:space="preserve">Amina and Farouk’s marriage is a Muslim marriage within the amended Divorce Act and subsisted on 15 December 2014. The </w:t>
       </w:r>
       <w:r>
         <w:rPr>
@@ -2083,18 +1552,7 @@
       </w:r>
       <w:r>
         <w:rPr/>
-        <w:t xml:space="preserve"> may retain religious significance but does not dissolve the marriage in civil law, which continues to subsist until a court grants a decree. Section 6 creates uncertainty, as </w:t>
-      </w:r>
-      <w:r>
-        <w:rPr>
-          <w:i/>
-          <w:iCs/>
-        </w:rPr>
-        <w:t>H.A v N.A</w:t>
-      </w:r>
-      <w:r>
-        <w:rPr/>
-        <w:t xml:space="preserve"> shows, but it is best resolved by the text of sections 3 and 6(b), the remedial purpose of the Amendment Act, the Full Bench in </w:t>
+        <w:t xml:space="preserve"> may retain religious significance but does not dissolve the marriage in civil law, which continues until a court grants a decree. Section 6 creates uncertainty, but it is best resolved by the text of sections 3 and 6(b), the remedial purpose of the Act, </w:t>
       </w:r>
       <w:r>
         <w:rPr>
@@ -2105,29 +1563,7 @@
       </w:r>
       <w:r>
         <w:rPr/>
-        <w:t xml:space="preserve">, and section 39(2) of the Constitution. Farouk’s application for a declaration that the </w:t>
-      </w:r>
-      <w:r>
-        <w:rPr>
-          <w:i/>
-          <w:iCs/>
-        </w:rPr>
-        <w:t>talaq</w:t>
-      </w:r>
-      <w:r>
-        <w:rPr/>
-        <w:t xml:space="preserve"> conclusively dissolved the marriage should be refused, Amina should be free to pursue divorce, interim relief and financial remedies, and the court should distinguish the religious validity of </w:t>
-      </w:r>
-      <w:r>
-        <w:rPr>
-          <w:i/>
-          <w:iCs/>
-        </w:rPr>
-        <w:t>talaq</w:t>
-      </w:r>
-      <w:r>
-        <w:rPr/>
-        <w:t xml:space="preserve"> from its civil-law consequences. That approach reconciles Islamic principles with the Constitution and protects equality, dignity, access to courts and legal certainty.</w:t>
+        <w:t xml:space="preserve"> and section 39(2). Farouk’s declaration should be refused, and Amina should remain free to pursue divorce, interim relief and financial remedies. That approach reconciles Islamic principles with the Constitution and protects equality, dignity, access to courts and legal certainty.</w:t>
       </w:r>
     </w:p>
     <w:p>
@@ -2137,71 +1573,10 @@
       </w:pPr>
       <w:r>
         <w:rPr/>
-        <mc:AlternateContent>
-          <mc:Choice Requires="wps">
-            <w:drawing>
-              <wp:inline distT="0" distB="0" distL="0" distR="0">
-                <wp:extent cx="5731510" cy="19050"/>
-                <wp:effectExtent l="0" t="0" r="0" b="0"/>
-                <wp:docPr id="1" name=""/>
-                <a:graphic xmlns:a="http://schemas.openxmlformats.org/drawingml/2006/main">
-                  <a:graphicData uri="http://schemas.microsoft.com/office/word/2010/wordprocessingShape">
-                    <wps:wsp>
-                      <wps:cNvSpPr/>
-                      <wps:nvSpPr>
-                        <wps:cNvPr id="2" name=""/>
-                        <wps:cNvSpPr/>
-                      </wps:nvSpPr>
-                      <wps:spPr>
-                        <a:xfrm>
-                          <a:off x="0" y="0"/>
-                          <a:ext cx="5731560" cy="19080"/>
-                        </a:xfrm>
-                        <a:prstGeom prst="rect">
-                          <a:avLst/>
-                        </a:prstGeom>
-                        <a:solidFill>
-                          <a:srgbClr val="ffffff"/>
-                        </a:solidFill>
-                        <a:ln w="0">
-                          <a:solidFill>
-                            <a:srgbClr val="000000"/>
-                          </a:solidFill>
-                        </a:ln>
-                      </wps:spPr>
-                      <wps:bodyPr/>
-                    </wps:wsp>
-                  </a:graphicData>
-                </a:graphic>
-                <wp14:sizeRelH relativeFrom="page">
-                  <wp14:pctWidth>100000</wp14:pctWidth>
-                </wp14:sizeRelH>
-              </wp:inline>
-            </w:drawing>
-          </mc:Choice>
-          <mc:Fallback>
-            <w:pict>
-              <v:rect id="shape_0" fillcolor="white" stroked="t" o:allowincell="f" style="position:absolute;margin-left:0pt;margin-top:-1.55pt;width:451.25pt;height:1.45pt;mso-wrap-style:none;v-text-anchor:middle;mso-position-horizontal:center;mso-position-vertical:top">
-                <v:fill o:detectmouseclick="t" type="solid" color2="black"/>
-                <v:stroke color="black" joinstyle="round" endcap="flat"/>
-                <w10:wrap type="topAndBottom"/>
-              </v:rect>
-            </w:pict>
-          </mc:Fallback>
-        </mc:AlternateContent>
-      </w:r>
-    </w:p>
-    <w:p>
-      <w:pPr>
-        <w:pStyle w:val="Normal"/>
-        <w:rPr/>
-      </w:pPr>
-      <w:r>
-        <w:rPr/>
-      </w:r>
-      <w:bookmarkStart w:id="33" w:name="conclusion"/>
-      <w:bookmarkStart w:id="34" w:name="conclusion"/>
-      <w:bookmarkEnd w:id="34"/>
+      </w:r>
+      <w:bookmarkStart w:id="25" w:name="conclusion"/>
+      <w:bookmarkStart w:id="26" w:name="conclusion"/>
+      <w:bookmarkEnd w:id="26"/>
       <w:r>
         <w:br w:type="page"/>
       </w:r>
@@ -2212,9 +1587,9 @@
         <w:spacing w:before="0" w:after="120"/>
         <w:rPr/>
       </w:pPr>
-      <w:bookmarkStart w:id="35" w:name="__RefHeading___Toc1239_933187192"/>
-      <w:bookmarkStart w:id="36" w:name="bibliography"/>
-      <w:bookmarkEnd w:id="35"/>
+      <w:bookmarkStart w:id="27" w:name="__RefHeading___Toc969_3227372185"/>
+      <w:bookmarkStart w:id="28" w:name="bibliography"/>
+      <w:bookmarkEnd w:id="27"/>
       <w:r>
         <w:rPr/>
         <w:t>Bibliography</w:t>
@@ -2418,23 +1793,6 @@
       <w:r>
         <w:rPr/>
         <w:t xml:space="preserve"> (2025/094930) [2025] ZAWCHC 440</w:t>
-      </w:r>
-    </w:p>
-    <w:p>
-      <w:pPr>
-        <w:pStyle w:val="BodyText"/>
-        <w:rPr/>
-      </w:pPr>
-      <w:r>
-        <w:rPr>
-          <w:i/>
-          <w:iCs/>
-        </w:rPr>
-        <w:t>Taylor v Kurstag NO</w:t>
-      </w:r>
-      <w:r>
-        <w:rPr/>
-        <w:t xml:space="preserve"> 2005 (1) SA 362 (W)</w:t>
       </w:r>
     </w:p>
     <w:p>
@@ -2675,7 +2033,7 @@
         <w:rPr/>
         <w:t xml:space="preserve"> 251</w:t>
       </w:r>
-      <w:bookmarkEnd w:id="36"/>
+      <w:bookmarkEnd w:id="28"/>
     </w:p>
     <w:sectPr>
       <w:footerReference w:type="even" r:id="rId2"/>
@@ -2735,7 +2093,7 @@
     </w:r>
     <w:r>
       <w:rPr/>
-      <w:t>12</w:t>
+      <w:t>9</w:t>
     </w:r>
     <w:r>
       <w:rPr/>
@@ -2844,7 +2202,7 @@
           <w:i/>
           <w:iCs/>
         </w:rPr>
-        <w:t>Women’s Legal Centre Trust v President of the Republic of South Africa and Others</w:t>
+        <w:t>Women’s Legal Centre Trust v President of the Republic of South Africa</w:t>
       </w:r>
       <w:r>
         <w:rPr/>
@@ -2903,7 +2261,29 @@
       </w:r>
       <w:r>
         <w:rPr/>
-        <w:t xml:space="preserve"> 1997 (2) SA 690 (C).</w:t>
+        <w:t xml:space="preserve"> 1997 (2) SA 690 (C); </w:t>
+      </w:r>
+      <w:r>
+        <w:rPr>
+          <w:i/>
+          <w:iCs/>
+        </w:rPr>
+        <w:t>Daniels v Campbell NO</w:t>
+      </w:r>
+      <w:r>
+        <w:rPr/>
+        <w:t xml:space="preserve"> 2004 (5) SA 331 (CC); </w:t>
+      </w:r>
+      <w:r>
+        <w:rPr>
+          <w:i/>
+          <w:iCs/>
+        </w:rPr>
+        <w:t>Hassam v Jacobs NO</w:t>
+      </w:r>
+      <w:r>
+        <w:rPr/>
+        <w:t xml:space="preserve"> 2009 (5) SA 572 (CC).</w:t>
       </w:r>
     </w:p>
   </w:footnote>
@@ -2926,26 +2306,8 @@
         <w:t xml:space="preserve"> </w:t>
       </w:r>
       <w:r>
-        <w:rPr>
-          <w:i/>
-          <w:iCs/>
-        </w:rPr>
-        <w:t>Daniels v Campbell NO</w:t>
-      </w:r>
-      <w:r>
-        <w:rPr/>
-        <w:t xml:space="preserve"> 2004 (5) SA 331 (CC); </w:t>
-      </w:r>
-      <w:r>
-        <w:rPr>
-          <w:i/>
-          <w:iCs/>
-        </w:rPr>
-        <w:t>Hassam v Jacobs NO</w:t>
-      </w:r>
-      <w:r>
-        <w:rPr/>
-        <w:t xml:space="preserve"> 2009 (5) SA 572 (CC).</w:t>
+        <w:rPr/>
+        <w:t>Divorce Amendment Act ss 1 and 2, amending ss 1 and 3 of the Divorce Act 70 of 1979.</w:t>
       </w:r>
     </w:p>
   </w:footnote>
@@ -2968,15 +2330,19 @@
         <w:t xml:space="preserve"> </w:t>
       </w:r>
       <w:r>
-        <w:rPr>
-          <w:i/>
-          <w:iCs/>
-        </w:rPr>
-        <w:t>WLCT</w:t>
-      </w:r>
-      <w:r>
-        <w:rPr/>
-        <w:t xml:space="preserve"> (n 2).</w:t>
+        <w:rPr/>
+        <w:t xml:space="preserve">J Heaton (ed), </w:t>
+      </w:r>
+      <w:r>
+        <w:rPr>
+          <w:i/>
+          <w:iCs/>
+        </w:rPr>
+        <w:t>The Law of Divorce and Dissolution of Life Partnerships in South Africa</w:t>
+      </w:r>
+      <w:r>
+        <w:rPr/>
+        <w:t xml:space="preserve"> (Juta 2014) pt 1.</w:t>
       </w:r>
     </w:p>
   </w:footnote>
@@ -3000,7 +2366,29 @@
       </w:r>
       <w:r>
         <w:rPr/>
-        <w:t>Divorce Amendment Act s 1.</w:t>
+        <w:t xml:space="preserve">JD Mujuzi, ‘Dissolving a Muslim Marriage in South Africa and the Right to Freedom from Discrimination: The Talaaq v. the Divorce Amendment Act (2024) “Routes” in the Context of </w:t>
+      </w:r>
+      <w:r>
+        <w:rPr>
+          <w:i/>
+          <w:iCs/>
+        </w:rPr>
+        <w:t>H.A v N.A</w:t>
+      </w:r>
+      <w:r>
+        <w:rPr/>
+        <w:t xml:space="preserve"> (February 2025)’ (2026) 26(1) </w:t>
+      </w:r>
+      <w:r>
+        <w:rPr>
+          <w:i/>
+          <w:iCs/>
+        </w:rPr>
+        <w:t>International Journal of Discrimination and the Law</w:t>
+      </w:r>
+      <w:r>
+        <w:rPr/>
+        <w:t xml:space="preserve"> 197.</w:t>
       </w:r>
     </w:p>
   </w:footnote>
@@ -3024,7 +2412,7 @@
       </w:r>
       <w:r>
         <w:rPr/>
-        <w:t>Divorce Amendment Act s 2, amending s 3 of the Divorce Act.</w:t>
+        <w:t>Divorce Amendment Act s 6.</w:t>
       </w:r>
     </w:p>
   </w:footnote>
@@ -3047,19 +2435,15 @@
         <w:t xml:space="preserve"> </w:t>
       </w:r>
       <w:r>
-        <w:rPr/>
-        <w:t xml:space="preserve">J Heaton (ed) </w:t>
-      </w:r>
-      <w:r>
-        <w:rPr>
-          <w:i/>
-          <w:iCs/>
-        </w:rPr>
-        <w:t>The Law of Divorce and Dissolution of Life Partnerships in South Africa</w:t>
-      </w:r>
-      <w:r>
-        <w:rPr/>
-        <w:t xml:space="preserve"> (Juta 2014) pt 1.</w:t>
+        <w:rPr>
+          <w:i/>
+          <w:iCs/>
+        </w:rPr>
+        <w:t>H.A v N.A</w:t>
+      </w:r>
+      <w:r>
+        <w:rPr/>
+        <w:t xml:space="preserve"> (144907/2024) [2025] ZAGPPHC 121.</w:t>
       </w:r>
     </w:p>
   </w:footnote>
@@ -3082,30 +2466,15 @@
         <w:t xml:space="preserve"> </w:t>
       </w:r>
       <w:r>
-        <w:rPr/>
-        <w:t xml:space="preserve">JD Mujuzi, ‘Dissolving a Muslim marriage in South Africa and the right to freedom from discrimination: The talaaq v. the Divorce Amendment Act (2024) “routes” in the context of </w:t>
-      </w:r>
-      <w:r>
-        <w:rPr>
-          <w:i/>
-          <w:iCs/>
-        </w:rPr>
-        <w:t>H.A v N.A</w:t>
-      </w:r>
-      <w:r>
-        <w:rPr/>
-        <w:t xml:space="preserve"> (February 2025)’ (2026) 26(1) </w:t>
-      </w:r>
-      <w:r>
-        <w:rPr>
-          <w:i/>
-          <w:iCs/>
-        </w:rPr>
-        <w:t>International Journal of Discrimination and the Law</w:t>
-      </w:r>
-      <w:r>
-        <w:rPr/>
-        <w:t xml:space="preserve"> 197.</w:t>
+        <w:rPr>
+          <w:i/>
+          <w:iCs/>
+        </w:rPr>
+        <w:t>E.S v H.Z.A</w:t>
+      </w:r>
+      <w:r>
+        <w:rPr/>
+        <w:t xml:space="preserve"> (A2023/062743) [2026] ZAGPJHC 262; 2026 (5) SA 140 (GJ).</w:t>
       </w:r>
     </w:p>
   </w:footnote>
@@ -3129,7 +2498,7 @@
       </w:r>
       <w:r>
         <w:rPr/>
-        <w:t>Divorce Amendment Act s 6.</w:t>
+        <w:t>Superior Courts Act 10 of 2013 s 21(1)(c).</w:t>
       </w:r>
     </w:p>
   </w:footnote>
@@ -3156,11 +2525,22 @@
           <w:i/>
           <w:iCs/>
         </w:rPr>
-        <w:t>H.A v N.A</w:t>
-      </w:r>
-      <w:r>
-        <w:rPr/>
-        <w:t xml:space="preserve"> (144907/2024) [2025] ZAGPPHC 121.</w:t>
+        <w:t>Harksen v Lane NO</w:t>
+      </w:r>
+      <w:r>
+        <w:rPr/>
+        <w:t xml:space="preserve"> 1998 (1) SA 300 (CC); </w:t>
+      </w:r>
+      <w:r>
+        <w:rPr>
+          <w:i/>
+          <w:iCs/>
+        </w:rPr>
+        <w:t>President of the Republic of South Africa v Hugo</w:t>
+      </w:r>
+      <w:r>
+        <w:rPr/>
+        <w:t xml:space="preserve"> 1997 (4) SA 1 (CC).</w:t>
       </w:r>
     </w:p>
   </w:footnote>
@@ -3187,11 +2567,22 @@
           <w:i/>
           <w:iCs/>
         </w:rPr>
-        <w:t>E.S v H.Z.A</w:t>
-      </w:r>
-      <w:r>
-        <w:rPr/>
-        <w:t xml:space="preserve"> (A2023/062743) [2026] ZAGPJHC 262; 2026 (5) SA 140 (GJ).</w:t>
+        <w:t>Gumede v President of the Republic of South Africa</w:t>
+      </w:r>
+      <w:r>
+        <w:rPr/>
+        <w:t xml:space="preserve"> 2009 (3) SA 152 (CC); </w:t>
+      </w:r>
+      <w:r>
+        <w:rPr>
+          <w:i/>
+          <w:iCs/>
+        </w:rPr>
+        <w:t>Mayelane v Ngwenyama</w:t>
+      </w:r>
+      <w:r>
+        <w:rPr/>
+        <w:t xml:space="preserve"> 2013 (4) SA 415 (CC).</w:t>
       </w:r>
     </w:p>
   </w:footnote>
@@ -3214,15 +2605,8 @@
         <w:t xml:space="preserve"> </w:t>
       </w:r>
       <w:r>
-        <w:rPr>
-          <w:i/>
-          <w:iCs/>
-        </w:rPr>
-        <w:t>Harksen v Lane NO</w:t>
-      </w:r>
-      <w:r>
-        <w:rPr/>
-        <w:t xml:space="preserve"> 1998 (1) SA 300 (CC).</w:t>
+        <w:rPr/>
+        <w:t>Mujuzi (n 7).</w:t>
       </w:r>
     </w:p>
   </w:footnote>
@@ -3249,11 +2633,11 @@
           <w:i/>
           <w:iCs/>
         </w:rPr>
-        <w:t>President of the Republic of South Africa v Hugo</w:t>
-      </w:r>
-      <w:r>
-        <w:rPr/>
-        <w:t xml:space="preserve"> 1997 (4) SA 1 (CC).</w:t>
+        <w:t>Christian Education South Africa v Minister of Education</w:t>
+      </w:r>
+      <w:r>
+        <w:rPr/>
+        <w:t xml:space="preserve"> 2000 (4) SA 757 (CC).</w:t>
       </w:r>
     </w:p>
   </w:footnote>
@@ -3276,15 +2660,8 @@
         <w:t xml:space="preserve"> </w:t>
       </w:r>
       <w:r>
-        <w:rPr>
-          <w:i/>
-          <w:iCs/>
-        </w:rPr>
-        <w:t>Gumede v President of the Republic of South Africa</w:t>
-      </w:r>
-      <w:r>
-        <w:rPr/>
-        <w:t xml:space="preserve"> 2009 (3) SA 152 (CC).</w:t>
+        <w:rPr/>
+        <w:t>Osman-Hyder (n 1).</w:t>
       </w:r>
     </w:p>
   </w:footnote>
@@ -3307,15 +2684,8 @@
         <w:t xml:space="preserve"> </w:t>
       </w:r>
       <w:r>
-        <w:rPr>
-          <w:i/>
-          <w:iCs/>
-        </w:rPr>
-        <w:t>Mayelane v Ngwenyama</w:t>
-      </w:r>
-      <w:r>
-        <w:rPr/>
-        <w:t xml:space="preserve"> 2013 (4) SA 415 (CC).</w:t>
+        <w:rPr/>
+        <w:t>Heaton (n 6) pt 3 (N Moosa and C Rautenbach).</w:t>
       </w:r>
     </w:p>
   </w:footnote>
@@ -3339,7 +2709,18 @@
       </w:r>
       <w:r>
         <w:rPr/>
-        <w:t>Mujuzi (n 10).</w:t>
+        <w:t xml:space="preserve">W Amien, ‘Judicial Intervention in Facilitating Legal Recognition (and Regulation) of Muslim Family Law in Muslim-Minority Countries: The Case of South Africa’ (2020) 1(1) </w:t>
+      </w:r>
+      <w:r>
+        <w:rPr>
+          <w:i/>
+          <w:iCs/>
+        </w:rPr>
+        <w:t>Journal of Islamic Law</w:t>
+      </w:r>
+      <w:r>
+        <w:rPr/>
+        <w:t>.</w:t>
       </w:r>
     </w:p>
   </w:footnote>
@@ -3362,15 +2743,8 @@
         <w:t xml:space="preserve"> </w:t>
       </w:r>
       <w:r>
-        <w:rPr>
-          <w:i/>
-          <w:iCs/>
-        </w:rPr>
-        <w:t>Christian Education South Africa v Minister of Education</w:t>
-      </w:r>
-      <w:r>
-        <w:rPr/>
-        <w:t xml:space="preserve"> 2000 (4) SA 757 (CC).</w:t>
+        <w:rPr/>
+        <w:t>Divorce Act s 5A.</w:t>
       </w:r>
     </w:p>
   </w:footnote>
@@ -3394,7 +2768,7 @@
       </w:r>
       <w:r>
         <w:rPr/>
-        <w:t>Osman-Hyder (n 1).</w:t>
+        <w:t>Divorce Act ss 7(3A) and 7(4), inserted or substituted by Divorce Amendment Act s 4.</w:t>
       </w:r>
     </w:p>
   </w:footnote>
@@ -3417,19 +2791,15 @@
         <w:t xml:space="preserve"> </w:t>
       </w:r>
       <w:r>
-        <w:rPr/>
-        <w:t xml:space="preserve">J Heaton (ed) </w:t>
-      </w:r>
-      <w:r>
-        <w:rPr>
-          <w:i/>
-          <w:iCs/>
-        </w:rPr>
-        <w:t>The Law of Divorce and Dissolution of Life Partnerships in South Africa</w:t>
-      </w:r>
-      <w:r>
-        <w:rPr/>
-        <w:t xml:space="preserve"> (Juta 2014) pt 3 (N Moosa and C Rautenbach).</w:t>
+        <w:rPr>
+          <w:i/>
+          <w:iCs/>
+        </w:rPr>
+        <w:t>E.S v H.Z.A</w:t>
+      </w:r>
+      <w:r>
+        <w:rPr/>
+        <w:t xml:space="preserve"> (n 10).</w:t>
       </w:r>
     </w:p>
   </w:footnote>
@@ -3452,183 +2822,6 @@
         <w:t xml:space="preserve"> </w:t>
       </w:r>
       <w:r>
-        <w:rPr/>
-        <w:t xml:space="preserve">W Amien, ‘Judicial Intervention in Facilitating Legal Recognition (and Regulation) of Muslim Family Law in Muslim-Minority Countries: The Case of South Africa’ (2020) 1(1) </w:t>
-      </w:r>
-      <w:r>
-        <w:rPr>
-          <w:i/>
-          <w:iCs/>
-        </w:rPr>
-        <w:t>Journal of Islamic Law</w:t>
-      </w:r>
-      <w:r>
-        <w:rPr/>
-        <w:t>.</w:t>
-      </w:r>
-    </w:p>
-  </w:footnote>
-  <w:footnote w:id="24">
-    <w:p>
-      <w:pPr>
-        <w:pStyle w:val="FootnoteText"/>
-        <w:spacing w:lineRule="auto" w:line="240" w:before="0" w:after="40"/>
-        <w:jc w:val="left"/>
-        <w:rPr/>
-      </w:pPr>
-      <w:r>
-        <w:rPr>
-          <w:rStyle w:val="FootnoteCharacters"/>
-        </w:rPr>
-        <w:footnoteRef/>
-      </w:r>
-      <w:r>
-        <w:rPr/>
-        <w:t xml:space="preserve"> </w:t>
-      </w:r>
-      <w:r>
-        <w:rPr/>
-        <w:t xml:space="preserve">Divorce Act s 5A; </w:t>
-      </w:r>
-      <w:r>
-        <w:rPr>
-          <w:i/>
-          <w:iCs/>
-        </w:rPr>
-        <w:t>Taylor v Kurstag NO</w:t>
-      </w:r>
-      <w:r>
-        <w:rPr/>
-        <w:t xml:space="preserve"> 2005 (1) SA 362 (W).</w:t>
-      </w:r>
-    </w:p>
-  </w:footnote>
-  <w:footnote w:id="25">
-    <w:p>
-      <w:pPr>
-        <w:pStyle w:val="FootnoteText"/>
-        <w:spacing w:lineRule="auto" w:line="240" w:before="0" w:after="40"/>
-        <w:jc w:val="left"/>
-        <w:rPr/>
-      </w:pPr>
-      <w:r>
-        <w:rPr>
-          <w:rStyle w:val="FootnoteCharacters"/>
-        </w:rPr>
-        <w:footnoteRef/>
-      </w:r>
-      <w:r>
-        <w:rPr/>
-        <w:t xml:space="preserve"> </w:t>
-      </w:r>
-      <w:r>
-        <w:rPr/>
-        <w:t>Divorce Act ss 7(3A), 7(4), inserted or substituted by Divorce Amendment Act s 4.</w:t>
-      </w:r>
-    </w:p>
-  </w:footnote>
-  <w:footnote w:id="26">
-    <w:p>
-      <w:pPr>
-        <w:pStyle w:val="FootnoteText"/>
-        <w:spacing w:lineRule="auto" w:line="240" w:before="0" w:after="40"/>
-        <w:jc w:val="left"/>
-        <w:rPr/>
-      </w:pPr>
-      <w:r>
-        <w:rPr>
-          <w:rStyle w:val="FootnoteCharacters"/>
-        </w:rPr>
-        <w:footnoteRef/>
-      </w:r>
-      <w:r>
-        <w:rPr/>
-        <w:t xml:space="preserve"> </w:t>
-      </w:r>
-      <w:r>
-        <w:rPr/>
-        <w:t>Divorce Act s 7(5)(aA), inserted by Divorce Amendment Act s 4.</w:t>
-      </w:r>
-    </w:p>
-  </w:footnote>
-  <w:footnote w:id="27">
-    <w:p>
-      <w:pPr>
-        <w:pStyle w:val="FootnoteText"/>
-        <w:spacing w:lineRule="auto" w:line="240" w:before="0" w:after="40"/>
-        <w:jc w:val="left"/>
-        <w:rPr/>
-      </w:pPr>
-      <w:r>
-        <w:rPr>
-          <w:rStyle w:val="FootnoteCharacters"/>
-        </w:rPr>
-        <w:footnoteRef/>
-      </w:r>
-      <w:r>
-        <w:rPr/>
-        <w:t xml:space="preserve"> </w:t>
-      </w:r>
-      <w:r>
-        <w:rPr/>
-        <w:t xml:space="preserve">J Heaton (ed) </w:t>
-      </w:r>
-      <w:r>
-        <w:rPr>
-          <w:i/>
-          <w:iCs/>
-        </w:rPr>
-        <w:t>The Law of Divorce and Dissolution of Life Partnerships in South Africa</w:t>
-      </w:r>
-      <w:r>
-        <w:rPr/>
-        <w:t xml:space="preserve"> (Juta 2014) ch 4 (J Heaton).</w:t>
-      </w:r>
-    </w:p>
-  </w:footnote>
-  <w:footnote w:id="28">
-    <w:p>
-      <w:pPr>
-        <w:pStyle w:val="FootnoteText"/>
-        <w:spacing w:lineRule="auto" w:line="240" w:before="0" w:after="40"/>
-        <w:jc w:val="left"/>
-        <w:rPr/>
-      </w:pPr>
-      <w:r>
-        <w:rPr>
-          <w:rStyle w:val="FootnoteCharacters"/>
-        </w:rPr>
-        <w:footnoteRef/>
-      </w:r>
-      <w:r>
-        <w:rPr/>
-        <w:t xml:space="preserve"> </w:t>
-      </w:r>
-      <w:r>
-        <w:rPr/>
-        <w:t>Mujuzi (n 10).</w:t>
-      </w:r>
-    </w:p>
-  </w:footnote>
-  <w:footnote w:id="29">
-    <w:p>
-      <w:pPr>
-        <w:pStyle w:val="FootnoteText"/>
-        <w:spacing w:lineRule="auto" w:line="240" w:before="0" w:after="40"/>
-        <w:jc w:val="left"/>
-        <w:rPr/>
-      </w:pPr>
-      <w:r>
-        <w:rPr>
-          <w:rStyle w:val="FootnoteCharacters"/>
-        </w:rPr>
-        <w:footnoteRef/>
-      </w:r>
-      <w:r>
-        <w:rPr/>
-        <w:t xml:space="preserve"> </w:t>
-      </w:r>
-      <w:r>
         <w:rPr>
           <w:i/>
           <w:iCs/>
@@ -3638,41 +2831,6 @@
       <w:r>
         <w:rPr/>
         <w:t xml:space="preserve"> (2025/094930) [2025] ZAWCHC 440.</w:t>
-      </w:r>
-    </w:p>
-  </w:footnote>
-  <w:footnote w:id="30">
-    <w:p>
-      <w:pPr>
-        <w:pStyle w:val="FootnoteText"/>
-        <w:spacing w:lineRule="auto" w:line="240" w:before="0" w:after="40"/>
-        <w:jc w:val="left"/>
-        <w:rPr/>
-      </w:pPr>
-      <w:r>
-        <w:rPr>
-          <w:rStyle w:val="FootnoteCharacters"/>
-        </w:rPr>
-        <w:footnoteRef/>
-      </w:r>
-      <w:r>
-        <w:rPr/>
-        <w:t xml:space="preserve"> </w:t>
-      </w:r>
-      <w:r>
-        <w:rPr/>
-        <w:t xml:space="preserve">J Heaton (ed) </w:t>
-      </w:r>
-      <w:r>
-        <w:rPr>
-          <w:i/>
-          <w:iCs/>
-        </w:rPr>
-        <w:t>The Law of Divorce and Dissolution of Life Partnerships in South Africa</w:t>
-      </w:r>
-      <w:r>
-        <w:rPr/>
-        <w:t xml:space="preserve"> (Juta 2014) ch 3 (JC Sonnekus).</w:t>
       </w:r>
     </w:p>
   </w:footnote>

</xml_diff>

<commit_message>
Fix blank page: use page-break-before instead of stray break paragraphs
Co-Authored-By: Claude Sonnet 5.5 <noreply@anthropic.com>
Claude-Session: https://claude.ai/code/session_01GuPG1GkPxQRMAjcW62QkGT
</commit_message>
<xml_diff>
--- a/Documents/Talaq_Divorce_Amendment_Act_Assignment_Formatted.docx
+++ b/Documents/Talaq_Divorce_Amendment_Act_Assignment_Formatted.docx
@@ -5,7 +5,6 @@
     <w:p>
       <w:pPr>
         <w:pStyle w:val="Title"/>
-        <w:keepNext w:val="true"/>
         <w:keepLines/>
         <w:spacing w:lineRule="auto" w:line="360" w:before="2600" w:after="1400"/>
         <w:jc w:val="center"/>
@@ -108,6 +107,7 @@
         <w:p>
           <w:pPr>
             <w:pStyle w:val="TOCHeading"/>
+            <w:pageBreakBefore/>
             <w:spacing w:lineRule="auto" w:line="360" w:before="240" w:after="120"/>
             <w:jc w:val="left"/>
             <w:rPr>
@@ -118,9 +118,7 @@
               <w:sz w:val="24"/>
             </w:rPr>
           </w:pPr>
-          <w:r>
-            <w:br w:type="page"/>
-          </w:r>
+          <w:r/>
           <w:r>
             <w:rPr>
               <w:rFonts w:eastAsia="Arial" w:cs="Arial"/>
@@ -459,19 +457,8 @@
     </w:sdt>
     <w:p>
       <w:pPr>
-        <w:pStyle w:val="Normal"/>
-        <w:rPr/>
-      </w:pPr>
-      <w:r>
-        <w:rPr/>
-      </w:r>
-      <w:r>
-        <w:br w:type="page"/>
-      </w:r>
-    </w:p>
-    <w:p>
-      <w:pPr>
         <w:pStyle w:val="Heading1"/>
+        <w:pageBreakBefore/>
         <w:spacing w:before="0" w:after="120"/>
         <w:rPr/>
       </w:pPr>
@@ -1568,22 +1555,8 @@
     </w:p>
     <w:p>
       <w:pPr>
-        <w:pStyle w:val="Normal"/>
-        <w:rPr/>
-      </w:pPr>
-      <w:r>
-        <w:rPr/>
-      </w:r>
-      <w:bookmarkStart w:id="25" w:name="conclusion"/>
-      <w:bookmarkStart w:id="26" w:name="conclusion"/>
-      <w:bookmarkEnd w:id="26"/>
-      <w:r>
-        <w:br w:type="page"/>
-      </w:r>
-    </w:p>
-    <w:p>
-      <w:pPr>
         <w:pStyle w:val="Heading1"/>
+        <w:pageBreakBefore/>
         <w:spacing w:before="0" w:after="120"/>
         <w:rPr/>
       </w:pPr>
@@ -3481,8 +3454,8 @@
     <w:next w:val="BodyText"/>
     <w:qFormat/>
     <w:pPr>
-      <w:keepNext w:val="true"/>
-      <w:keepLines/>
+      <w:keepNext w:val="0"/>
+      <w:keepLines w:val="0"/>
       <w:spacing w:lineRule="auto" w:line="360" w:before="2600" w:after="1400"/>
       <w:jc w:val="center"/>
     </w:pPr>
@@ -3501,8 +3474,8 @@
     <w:next w:val="BodyText"/>
     <w:qFormat/>
     <w:pPr>
-      <w:keepNext w:val="true"/>
-      <w:keepLines/>
+      <w:keepNext w:val="0"/>
+      <w:keepLines w:val="0"/>
       <w:spacing w:lineRule="auto" w:line="360" w:before="240" w:after="240"/>
       <w:jc w:val="center"/>
     </w:pPr>
@@ -3519,8 +3492,8 @@
     <w:next w:val="BodyText"/>
     <w:qFormat/>
     <w:pPr>
-      <w:keepNext w:val="true"/>
-      <w:keepLines/>
+      <w:keepNext w:val="0"/>
+      <w:keepLines w:val="0"/>
       <w:widowControl/>
       <w:bidi w:val="0"/>
       <w:spacing w:lineRule="auto" w:line="360" w:before="0" w:after="120"/>
@@ -3541,8 +3514,8 @@
     <w:next w:val="BodyText"/>
     <w:qFormat/>
     <w:pPr>
-      <w:keepNext w:val="true"/>
-      <w:keepLines/>
+      <w:keepNext w:val="0"/>
+      <w:keepLines w:val="0"/>
       <w:widowControl/>
       <w:bidi w:val="0"/>
       <w:spacing w:lineRule="auto" w:line="360" w:before="0" w:after="120"/>

</xml_diff>

<commit_message>
Narrow reliance on S.W v A.L to jurisdiction in Rule 43 proceedings
Co-Authored-By: Claude Sonnet 5.5 <noreply@anthropic.com>
Claude-Session: https://claude.ai/code/session_01GuPG1GkPxQRMAjcW62QkGT
</commit_message>
<xml_diff>
--- a/Documents/Talaq_Divorce_Amendment_Act_Assignment_Formatted.docx
+++ b/Documents/Talaq_Divorce_Amendment_Act_Assignment_Formatted.docx
@@ -156,7 +156,7 @@
             </w:rPr>
             <w:fldChar w:fldCharType="separate"/>
           </w:r>
-          <w:hyperlink w:anchor="__RefHeading___Toc945_3227372185">
+          <w:hyperlink w:anchor="__RefHeading___Toc945_3118404828">
             <w:r>
               <w:rPr>
                 <w:webHidden/>
@@ -177,7 +177,7 @@
             </w:tabs>
             <w:rPr/>
           </w:pPr>
-          <w:hyperlink w:anchor="__RefHeading___Toc947_3227372185">
+          <w:hyperlink w:anchor="__RefHeading___Toc947_3118404828">
             <w:r>
               <w:rPr>
                 <w:webHidden/>
@@ -212,7 +212,7 @@
             </w:tabs>
             <w:rPr/>
           </w:pPr>
-          <w:hyperlink w:anchor="__RefHeading___Toc949_3227372185">
+          <w:hyperlink w:anchor="__RefHeading___Toc949_3118404828">
             <w:r>
               <w:rPr>
                 <w:webHidden/>
@@ -233,7 +233,7 @@
             </w:tabs>
             <w:rPr/>
           </w:pPr>
-          <w:hyperlink w:anchor="__RefHeading___Toc951_3227372185">
+          <w:hyperlink w:anchor="__RefHeading___Toc951_3118404828">
             <w:r>
               <w:rPr>
                 <w:webHidden/>
@@ -254,7 +254,7 @@
             </w:tabs>
             <w:rPr/>
           </w:pPr>
-          <w:hyperlink w:anchor="__RefHeading___Toc953_3227372185">
+          <w:hyperlink w:anchor="__RefHeading___Toc953_3118404828">
             <w:r>
               <w:rPr>
                 <w:webHidden/>
@@ -275,7 +275,7 @@
             </w:tabs>
             <w:rPr/>
           </w:pPr>
-          <w:hyperlink w:anchor="__RefHeading___Toc955_3227372185">
+          <w:hyperlink w:anchor="__RefHeading___Toc955_3118404828">
             <w:r>
               <w:rPr>
                 <w:webHidden/>
@@ -309,7 +309,7 @@
             </w:tabs>
             <w:rPr/>
           </w:pPr>
-          <w:hyperlink w:anchor="__RefHeading___Toc957_3227372185">
+          <w:hyperlink w:anchor="__RefHeading___Toc957_3118404828">
             <w:r>
               <w:rPr>
                 <w:webHidden/>
@@ -330,7 +330,7 @@
             </w:tabs>
             <w:rPr/>
           </w:pPr>
-          <w:hyperlink w:anchor="__RefHeading___Toc959_3227372185">
+          <w:hyperlink w:anchor="__RefHeading___Toc959_3118404828">
             <w:r>
               <w:rPr>
                 <w:webHidden/>
@@ -351,7 +351,7 @@
             </w:tabs>
             <w:rPr/>
           </w:pPr>
-          <w:hyperlink w:anchor="__RefHeading___Toc961_3227372185">
+          <w:hyperlink w:anchor="__RefHeading___Toc961_3118404828">
             <w:r>
               <w:rPr>
                 <w:webHidden/>
@@ -372,7 +372,7 @@
             </w:tabs>
             <w:rPr/>
           </w:pPr>
-          <w:hyperlink w:anchor="__RefHeading___Toc963_3227372185">
+          <w:hyperlink w:anchor="__RefHeading___Toc963_3118404828">
             <w:r>
               <w:rPr>
                 <w:webHidden/>
@@ -393,7 +393,7 @@
             </w:tabs>
             <w:rPr/>
           </w:pPr>
-          <w:hyperlink w:anchor="__RefHeading___Toc965_3227372185">
+          <w:hyperlink w:anchor="__RefHeading___Toc965_3118404828">
             <w:r>
               <w:rPr>
                 <w:webHidden/>
@@ -414,7 +414,7 @@
             </w:tabs>
             <w:rPr/>
           </w:pPr>
-          <w:hyperlink w:anchor="__RefHeading___Toc967_3227372185">
+          <w:hyperlink w:anchor="__RefHeading___Toc967_3118404828">
             <w:r>
               <w:rPr>
                 <w:webHidden/>
@@ -435,7 +435,7 @@
             </w:tabs>
             <w:rPr/>
           </w:pPr>
-          <w:hyperlink w:anchor="__RefHeading___Toc969_3227372185">
+          <w:hyperlink w:anchor="__RefHeading___Toc969_3118404828">
             <w:r>
               <w:rPr>
                 <w:webHidden/>
@@ -462,7 +462,7 @@
         <w:spacing w:before="0" w:after="120"/>
         <w:rPr/>
       </w:pPr>
-      <w:bookmarkStart w:id="0" w:name="__RefHeading___Toc945_3227372185"/>
+      <w:bookmarkStart w:id="0" w:name="__RefHeading___Toc945_3118404828"/>
       <w:bookmarkStart w:id="1" w:name="introduction"/>
       <w:bookmarkEnd w:id="0"/>
       <w:r>
@@ -583,7 +583,7 @@
         <w:pStyle w:val="Heading1"/>
         <w:rPr/>
       </w:pPr>
-      <w:bookmarkStart w:id="2" w:name="__RefHeading___Toc947_3227372185"/>
+      <w:bookmarkStart w:id="2" w:name="__RefHeading___Toc947_3118404828"/>
       <w:bookmarkStart w:id="3" w:name="X0a17aedc4f4a1acf6363978e189dbaa4a883cb6"/>
       <w:bookmarkEnd w:id="2"/>
       <w:r>
@@ -614,7 +614,7 @@
         <w:pStyle w:val="Heading2"/>
         <w:rPr/>
       </w:pPr>
-      <w:bookmarkStart w:id="4" w:name="__RefHeading___Toc949_3227372185"/>
+      <w:bookmarkStart w:id="4" w:name="__RefHeading___Toc949_3118404828"/>
       <w:bookmarkStart w:id="5" w:name="the-amendment-act"/>
       <w:bookmarkEnd w:id="4"/>
       <w:r>
@@ -735,7 +735,7 @@
         <w:pStyle w:val="Heading2"/>
         <w:rPr/>
       </w:pPr>
-      <w:bookmarkStart w:id="6" w:name="__RefHeading___Toc951_3227372185"/>
+      <w:bookmarkStart w:id="6" w:name="__RefHeading___Toc951_3118404828"/>
       <w:bookmarkStart w:id="7" w:name="section-6"/>
       <w:bookmarkEnd w:id="6"/>
       <w:r>
@@ -868,7 +868,7 @@
         <w:pStyle w:val="Heading2"/>
         <w:rPr/>
       </w:pPr>
-      <w:bookmarkStart w:id="9" w:name="__RefHeading___Toc953_3227372185"/>
+      <w:bookmarkStart w:id="9" w:name="__RefHeading___Toc953_3118404828"/>
       <w:bookmarkStart w:id="10" w:name="application"/>
       <w:bookmarkEnd w:id="9"/>
       <w:r>
@@ -943,7 +943,7 @@
         <w:pStyle w:val="Heading1"/>
         <w:rPr/>
       </w:pPr>
-      <w:bookmarkStart w:id="11" w:name="__RefHeading___Toc955_3227372185"/>
+      <w:bookmarkStart w:id="11" w:name="__RefHeading___Toc955_3118404828"/>
       <w:bookmarkStart w:id="12" w:name="Xee589dd567013339000a545aadebc1fd688232b"/>
       <w:bookmarkEnd w:id="11"/>
       <w:r>
@@ -970,7 +970,7 @@
         <w:pStyle w:val="Heading2"/>
         <w:rPr/>
       </w:pPr>
-      <w:bookmarkStart w:id="13" w:name="__RefHeading___Toc957_3227372185"/>
+      <w:bookmarkStart w:id="13" w:name="__RefHeading___Toc957_3118404828"/>
       <w:bookmarkStart w:id="14" w:name="equality-and-dignity"/>
       <w:bookmarkEnd w:id="13"/>
       <w:r>
@@ -1076,7 +1076,7 @@
         <w:pStyle w:val="Heading2"/>
         <w:rPr/>
       </w:pPr>
-      <w:bookmarkStart w:id="15" w:name="__RefHeading___Toc959_3227372185"/>
+      <w:bookmarkStart w:id="15" w:name="__RefHeading___Toc959_3118404828"/>
       <w:bookmarkStart w:id="16" w:name="religious-freedom"/>
       <w:bookmarkEnd w:id="15"/>
       <w:r>
@@ -1160,7 +1160,7 @@
         <w:pStyle w:val="Heading2"/>
         <w:rPr/>
       </w:pPr>
-      <w:bookmarkStart w:id="17" w:name="__RefHeading___Toc961_3227372185"/>
+      <w:bookmarkStart w:id="17" w:name="__RefHeading___Toc961_3118404828"/>
       <w:bookmarkStart w:id="18" w:name="access-to-courts-children-and-limitation"/>
       <w:bookmarkEnd w:id="17"/>
       <w:r>
@@ -1236,7 +1236,7 @@
         <w:pStyle w:val="Heading1"/>
         <w:rPr/>
       </w:pPr>
-      <w:bookmarkStart w:id="19" w:name="__RefHeading___Toc963_3227372185"/>
+      <w:bookmarkStart w:id="19" w:name="__RefHeading___Toc963_3118404828"/>
       <w:bookmarkStart w:id="20" w:name="practical-and-doctrinal-challenges"/>
       <w:bookmarkEnd w:id="19"/>
       <w:r>
@@ -1367,7 +1367,7 @@
         <w:pStyle w:val="Heading1"/>
         <w:rPr/>
       </w:pPr>
-      <w:bookmarkStart w:id="21" w:name="__RefHeading___Toc965_3227372185"/>
+      <w:bookmarkStart w:id="21" w:name="__RefHeading___Toc965_3118404828"/>
       <w:bookmarkStart w:id="22" w:name="X86e32ac461fbdb95b998a0f80996f305752e06d"/>
       <w:bookmarkEnd w:id="21"/>
       <w:r>
@@ -1475,7 +1475,7 @@
       </w:r>
       <w:r>
         <w:rPr/>
-        <w:t xml:space="preserve"> illustrates that a </w:t>
+        <w:t xml:space="preserve"> is relied on only for the narrow point that a </w:t>
       </w:r>
       <w:r>
         <w:rPr>
@@ -1486,7 +1486,7 @@
       </w:r>
       <w:r>
         <w:rPr/>
-        <w:t xml:space="preserve"> does not render divorce proceedings or Rule 43 relief moot.</w:t>
+        <w:t xml:space="preserve"> did not oust the court’s jurisdiction in Rule 43 proceedings.</w:t>
       </w:r>
       <w:r>
         <w:rPr>
@@ -1505,7 +1505,7 @@
         <w:pStyle w:val="Heading1"/>
         <w:rPr/>
       </w:pPr>
-      <w:bookmarkStart w:id="23" w:name="__RefHeading___Toc967_3227372185"/>
+      <w:bookmarkStart w:id="23" w:name="__RefHeading___Toc967_3118404828"/>
       <w:bookmarkStart w:id="24" w:name="conclusion"/>
       <w:bookmarkEnd w:id="23"/>
       <w:bookmarkEnd w:id="24"/>
@@ -1560,7 +1560,7 @@
         <w:spacing w:before="0" w:after="120"/>
         <w:rPr/>
       </w:pPr>
-      <w:bookmarkStart w:id="27" w:name="__RefHeading___Toc969_3227372185"/>
+      <w:bookmarkStart w:id="27" w:name="__RefHeading___Toc969_3118404828"/>
       <w:bookmarkStart w:id="28" w:name="bibliography"/>
       <w:bookmarkEnd w:id="27"/>
       <w:r>

</xml_diff>